<commit_message>
First Use Case formalization almost completed
</commit_message>
<xml_diff>
--- a/Documentazione/Documentazione finale/UseCasesCockburn.docx
+++ b/Documentazione/Documentazione finale/UseCasesCockburn.docx
@@ -4,7 +4,17 @@
   <w:body>
     <w:tbl>
       <w:tblPr>
-        <w:tblW w:w="5000" w:type="pct"/>
+        <w:tblpPr w:leftFromText="141" w:rightFromText="141" w:vertAnchor="text" w:tblpY="1"/>
+        <w:tblOverlap w:val="never"/>
+        <w:tblW w:w="5020" w:type="pct"/>
+        <w:tblBorders>
+          <w:top w:val="single" w:sz="8" w:space="0" w:color="00647A"/>
+          <w:left w:val="single" w:sz="8" w:space="0" w:color="00647A"/>
+          <w:bottom w:val="single" w:sz="8" w:space="0" w:color="00647A"/>
+          <w:right w:val="single" w:sz="8" w:space="0" w:color="00647A"/>
+          <w:insideH w:val="single" w:sz="8" w:space="0" w:color="00647A"/>
+          <w:insideV w:val="single" w:sz="8" w:space="0" w:color="00647A"/>
+        </w:tblBorders>
         <w:tblCellMar>
           <w:left w:w="0" w:type="dxa"/>
           <w:right w:w="0" w:type="dxa"/>
@@ -12,10 +22,10 @@
         <w:tblLook w:val="04A0" w:firstRow="1" w:lastRow="0" w:firstColumn="1" w:lastColumn="0" w:noHBand="0" w:noVBand="1"/>
       </w:tblPr>
       <w:tblGrid>
-        <w:gridCol w:w="2349"/>
-        <w:gridCol w:w="895"/>
-        <w:gridCol w:w="3422"/>
-        <w:gridCol w:w="3260"/>
+        <w:gridCol w:w="2348"/>
+        <w:gridCol w:w="1056"/>
+        <w:gridCol w:w="3263"/>
+        <w:gridCol w:w="3299"/>
       </w:tblGrid>
       <w:tr>
         <w:trPr>
@@ -23,13 +33,7 @@
         </w:trPr>
         <w:tc>
           <w:tcPr>
-            <w:tcW w:w="1183" w:type="pct"/>
-            <w:tcBorders>
-              <w:top w:val="single" w:sz="8" w:space="0" w:color="00647A"/>
-              <w:left w:val="single" w:sz="8" w:space="0" w:color="00647A"/>
-              <w:bottom w:val="single" w:sz="18" w:space="0" w:color="00647A"/>
-              <w:right w:val="single" w:sz="8" w:space="0" w:color="00647A"/>
-            </w:tcBorders>
+            <w:tcW w:w="1178" w:type="pct"/>
             <w:tcMar>
               <w:top w:w="72" w:type="dxa"/>
               <w:left w:w="144" w:type="dxa"/>
@@ -54,14 +58,8 @@
         </w:tc>
         <w:tc>
           <w:tcPr>
-            <w:tcW w:w="3817" w:type="pct"/>
+            <w:tcW w:w="3822" w:type="pct"/>
             <w:gridSpan w:val="3"/>
-            <w:tcBorders>
-              <w:top w:val="single" w:sz="8" w:space="0" w:color="00647A"/>
-              <w:left w:val="single" w:sz="8" w:space="0" w:color="00647A"/>
-              <w:bottom w:val="single" w:sz="18" w:space="0" w:color="00647A"/>
-              <w:right w:val="single" w:sz="8" w:space="0" w:color="00647A"/>
-            </w:tcBorders>
             <w:tcMar>
               <w:top w:w="72" w:type="dxa"/>
               <w:left w:w="144" w:type="dxa"/>
@@ -115,13 +113,7 @@
         </w:trPr>
         <w:tc>
           <w:tcPr>
-            <w:tcW w:w="1183" w:type="pct"/>
-            <w:tcBorders>
-              <w:top w:val="single" w:sz="18" w:space="0" w:color="00647A"/>
-              <w:left w:val="single" w:sz="8" w:space="0" w:color="00647A"/>
-              <w:bottom w:val="single" w:sz="8" w:space="0" w:color="00647A"/>
-              <w:right w:val="single" w:sz="8" w:space="0" w:color="00647A"/>
-            </w:tcBorders>
+            <w:tcW w:w="1178" w:type="pct"/>
             <w:shd w:val="clear" w:color="auto" w:fill="E7EAEC"/>
             <w:tcMar>
               <w:top w:w="72" w:type="dxa"/>
@@ -157,14 +149,8 @@
         </w:tc>
         <w:tc>
           <w:tcPr>
-            <w:tcW w:w="3817" w:type="pct"/>
+            <w:tcW w:w="3822" w:type="pct"/>
             <w:gridSpan w:val="3"/>
-            <w:tcBorders>
-              <w:top w:val="single" w:sz="18" w:space="0" w:color="00647A"/>
-              <w:left w:val="single" w:sz="8" w:space="0" w:color="00647A"/>
-              <w:bottom w:val="single" w:sz="8" w:space="0" w:color="00647A"/>
-              <w:right w:val="single" w:sz="8" w:space="0" w:color="00647A"/>
-            </w:tcBorders>
             <w:shd w:val="clear" w:color="auto" w:fill="E7EAEC"/>
             <w:tcMar>
               <w:top w:w="72" w:type="dxa"/>
@@ -195,13 +181,7 @@
         </w:trPr>
         <w:tc>
           <w:tcPr>
-            <w:tcW w:w="1183" w:type="pct"/>
-            <w:tcBorders>
-              <w:top w:val="single" w:sz="8" w:space="0" w:color="00647A"/>
-              <w:left w:val="single" w:sz="8" w:space="0" w:color="00647A"/>
-              <w:bottom w:val="single" w:sz="8" w:space="0" w:color="00647A"/>
-              <w:right w:val="single" w:sz="8" w:space="0" w:color="00647A"/>
-            </w:tcBorders>
+            <w:tcW w:w="1178" w:type="pct"/>
             <w:tcMar>
               <w:top w:w="72" w:type="dxa"/>
               <w:left w:w="144" w:type="dxa"/>
@@ -228,14 +208,8 @@
         </w:tc>
         <w:tc>
           <w:tcPr>
-            <w:tcW w:w="3817" w:type="pct"/>
+            <w:tcW w:w="3822" w:type="pct"/>
             <w:gridSpan w:val="3"/>
-            <w:tcBorders>
-              <w:top w:val="single" w:sz="8" w:space="0" w:color="00647A"/>
-              <w:left w:val="single" w:sz="8" w:space="0" w:color="00647A"/>
-              <w:bottom w:val="single" w:sz="8" w:space="0" w:color="00647A"/>
-              <w:right w:val="single" w:sz="8" w:space="0" w:color="00647A"/>
-            </w:tcBorders>
             <w:tcMar>
               <w:top w:w="72" w:type="dxa"/>
               <w:left w:w="144" w:type="dxa"/>
@@ -319,13 +293,7 @@
         </w:trPr>
         <w:tc>
           <w:tcPr>
-            <w:tcW w:w="1183" w:type="pct"/>
-            <w:tcBorders>
-              <w:top w:val="single" w:sz="8" w:space="0" w:color="00647A"/>
-              <w:left w:val="single" w:sz="8" w:space="0" w:color="00647A"/>
-              <w:bottom w:val="single" w:sz="8" w:space="0" w:color="00647A"/>
-              <w:right w:val="single" w:sz="8" w:space="0" w:color="00647A"/>
-            </w:tcBorders>
+            <w:tcW w:w="1178" w:type="pct"/>
             <w:shd w:val="clear" w:color="auto" w:fill="E7EAEC"/>
             <w:tcMar>
               <w:top w:w="72" w:type="dxa"/>
@@ -361,14 +329,8 @@
         </w:tc>
         <w:tc>
           <w:tcPr>
-            <w:tcW w:w="3817" w:type="pct"/>
+            <w:tcW w:w="3822" w:type="pct"/>
             <w:gridSpan w:val="3"/>
-            <w:tcBorders>
-              <w:top w:val="single" w:sz="8" w:space="0" w:color="00647A"/>
-              <w:left w:val="single" w:sz="8" w:space="0" w:color="00647A"/>
-              <w:bottom w:val="single" w:sz="8" w:space="0" w:color="00647A"/>
-              <w:right w:val="single" w:sz="8" w:space="0" w:color="00647A"/>
-            </w:tcBorders>
             <w:shd w:val="clear" w:color="auto" w:fill="E7EAEC"/>
             <w:tcMar>
               <w:top w:w="72" w:type="dxa"/>
@@ -394,7 +356,25 @@
               <w:rPr>
                 <w:lang w:val="en-US"/>
               </w:rPr>
-              <w:t>dded to the database and it is visible in the main board</w:t>
+              <w:t xml:space="preserve">dded to the database </w:t>
+            </w:r>
+            <w:r>
+              <w:rPr>
+                <w:lang w:val="en-US"/>
+              </w:rPr>
+              <w:t xml:space="preserve"> with a unique ID </w:t>
+            </w:r>
+            <w:r>
+              <w:rPr>
+                <w:lang w:val="en-US"/>
+              </w:rPr>
+              <w:t>and it is visible in the main board</w:t>
+            </w:r>
+            <w:r>
+              <w:rPr>
+                <w:lang w:val="en-US"/>
+              </w:rPr>
+              <w:t>; The user is redirected to the main board</w:t>
             </w:r>
           </w:p>
         </w:tc>
@@ -405,13 +385,7 @@
         </w:trPr>
         <w:tc>
           <w:tcPr>
-            <w:tcW w:w="1183" w:type="pct"/>
-            <w:tcBorders>
-              <w:top w:val="single" w:sz="8" w:space="0" w:color="00647A"/>
-              <w:left w:val="single" w:sz="8" w:space="0" w:color="00647A"/>
-              <w:bottom w:val="single" w:sz="8" w:space="0" w:color="00647A"/>
-              <w:right w:val="single" w:sz="8" w:space="0" w:color="00647A"/>
-            </w:tcBorders>
+            <w:tcW w:w="1178" w:type="pct"/>
             <w:tcMar>
               <w:top w:w="72" w:type="dxa"/>
               <w:left w:w="144" w:type="dxa"/>
@@ -456,14 +430,8 @@
         </w:tc>
         <w:tc>
           <w:tcPr>
-            <w:tcW w:w="3817" w:type="pct"/>
+            <w:tcW w:w="3822" w:type="pct"/>
             <w:gridSpan w:val="3"/>
-            <w:tcBorders>
-              <w:top w:val="single" w:sz="8" w:space="0" w:color="00647A"/>
-              <w:left w:val="single" w:sz="8" w:space="0" w:color="00647A"/>
-              <w:bottom w:val="single" w:sz="8" w:space="0" w:color="00647A"/>
-              <w:right w:val="single" w:sz="8" w:space="0" w:color="00647A"/>
-            </w:tcBorders>
             <w:tcMar>
               <w:top w:w="72" w:type="dxa"/>
               <w:left w:w="144" w:type="dxa"/>
@@ -493,13 +461,7 @@
         </w:trPr>
         <w:tc>
           <w:tcPr>
-            <w:tcW w:w="1183" w:type="pct"/>
-            <w:tcBorders>
-              <w:top w:val="single" w:sz="8" w:space="0" w:color="00647A"/>
-              <w:left w:val="single" w:sz="8" w:space="0" w:color="00647A"/>
-              <w:bottom w:val="single" w:sz="8" w:space="0" w:color="00647A"/>
-              <w:right w:val="single" w:sz="8" w:space="0" w:color="00647A"/>
-            </w:tcBorders>
+            <w:tcW w:w="1178" w:type="pct"/>
             <w:shd w:val="clear" w:color="auto" w:fill="E7EAEC"/>
             <w:tcMar>
               <w:top w:w="72" w:type="dxa"/>
@@ -545,14 +507,8 @@
         </w:tc>
         <w:tc>
           <w:tcPr>
-            <w:tcW w:w="3817" w:type="pct"/>
+            <w:tcW w:w="3822" w:type="pct"/>
             <w:gridSpan w:val="3"/>
-            <w:tcBorders>
-              <w:top w:val="single" w:sz="8" w:space="0" w:color="00647A"/>
-              <w:left w:val="single" w:sz="8" w:space="0" w:color="00647A"/>
-              <w:bottom w:val="single" w:sz="8" w:space="0" w:color="00647A"/>
-              <w:right w:val="single" w:sz="8" w:space="0" w:color="00647A"/>
-            </w:tcBorders>
             <w:shd w:val="clear" w:color="auto" w:fill="E7EAEC"/>
             <w:tcMar>
               <w:top w:w="72" w:type="dxa"/>
@@ -577,13 +533,7 @@
         </w:trPr>
         <w:tc>
           <w:tcPr>
-            <w:tcW w:w="1183" w:type="pct"/>
-            <w:tcBorders>
-              <w:top w:val="single" w:sz="8" w:space="0" w:color="00647A"/>
-              <w:left w:val="single" w:sz="8" w:space="0" w:color="00647A"/>
-              <w:bottom w:val="single" w:sz="8" w:space="0" w:color="00647A"/>
-              <w:right w:val="single" w:sz="8" w:space="0" w:color="00647A"/>
-            </w:tcBorders>
+            <w:tcW w:w="1178" w:type="pct"/>
             <w:tcMar>
               <w:top w:w="72" w:type="dxa"/>
               <w:left w:w="144" w:type="dxa"/>
@@ -608,14 +558,8 @@
         </w:tc>
         <w:tc>
           <w:tcPr>
-            <w:tcW w:w="3817" w:type="pct"/>
+            <w:tcW w:w="3822" w:type="pct"/>
             <w:gridSpan w:val="3"/>
-            <w:tcBorders>
-              <w:top w:val="single" w:sz="8" w:space="0" w:color="00647A"/>
-              <w:left w:val="single" w:sz="8" w:space="0" w:color="00647A"/>
-              <w:bottom w:val="single" w:sz="8" w:space="0" w:color="00647A"/>
-              <w:right w:val="single" w:sz="8" w:space="0" w:color="00647A"/>
-            </w:tcBorders>
             <w:tcMar>
               <w:top w:w="72" w:type="dxa"/>
               <w:left w:w="144" w:type="dxa"/>
@@ -657,13 +601,8 @@
         </w:trPr>
         <w:tc>
           <w:tcPr>
-            <w:tcW w:w="1183" w:type="pct"/>
+            <w:tcW w:w="1178" w:type="pct"/>
             <w:vMerge w:val="restart"/>
-            <w:tcBorders>
-              <w:top w:val="single" w:sz="8" w:space="0" w:color="00647A"/>
-              <w:left w:val="single" w:sz="8" w:space="0" w:color="00647A"/>
-              <w:right w:val="single" w:sz="8" w:space="0" w:color="00647A"/>
-            </w:tcBorders>
             <w:shd w:val="clear" w:color="auto" w:fill="E7EAEC"/>
             <w:tcMar>
               <w:top w:w="72" w:type="dxa"/>
@@ -683,93 +622,83 @@
                 <w:bCs/>
                 <w:lang w:val="en-US"/>
               </w:rPr>
-              <w:t>Main Scenario</w:t>
-            </w:r>
-          </w:p>
-        </w:tc>
-        <w:tc>
-          <w:tcPr>
-            <w:tcW w:w="451" w:type="pct"/>
-            <w:tcBorders>
-              <w:top w:val="single" w:sz="8" w:space="0" w:color="00647A"/>
-              <w:left w:val="single" w:sz="8" w:space="0" w:color="00647A"/>
-              <w:bottom w:val="single" w:sz="8" w:space="0" w:color="00647A"/>
-              <w:right w:val="single" w:sz="8" w:space="0" w:color="00647A"/>
-            </w:tcBorders>
-            <w:shd w:val="clear" w:color="auto" w:fill="E7EAEC"/>
-            <w:tcMar>
-              <w:top w:w="72" w:type="dxa"/>
-              <w:left w:w="144" w:type="dxa"/>
-              <w:bottom w:w="72" w:type="dxa"/>
-              <w:right w:w="144" w:type="dxa"/>
-            </w:tcMar>
-            <w:hideMark/>
-          </w:tcPr>
-          <w:p>
-            <w:pPr>
-              <w:spacing w:after="0"/>
-            </w:pPr>
-            <w:proofErr w:type="spellStart"/>
+              <w:t xml:space="preserve">Main </w:t>
+            </w:r>
             <w:r>
               <w:rPr>
                 <w:b/>
                 <w:bCs/>
-                <w:lang w:val="it-IT"/>
-              </w:rPr>
-              <w:t>Step</w:t>
-            </w:r>
-            <w:proofErr w:type="spellEnd"/>
+                <w:lang w:val="en-US"/>
+              </w:rPr>
+              <w:t>Scenario</w:t>
+            </w:r>
+          </w:p>
+        </w:tc>
+        <w:tc>
+          <w:tcPr>
+            <w:tcW w:w="530" w:type="pct"/>
+            <w:shd w:val="clear" w:color="auto" w:fill="E7EAEC"/>
+            <w:tcMar>
+              <w:top w:w="72" w:type="dxa"/>
+              <w:left w:w="144" w:type="dxa"/>
+              <w:bottom w:w="72" w:type="dxa"/>
+              <w:right w:w="144" w:type="dxa"/>
+            </w:tcMar>
+            <w:hideMark/>
+          </w:tcPr>
+          <w:p>
+            <w:pPr>
+              <w:spacing w:after="0"/>
+            </w:pPr>
+            <w:proofErr w:type="spellStart"/>
             <w:r>
               <w:rPr>
                 <w:b/>
                 <w:bCs/>
                 <w:lang w:val="it-IT"/>
               </w:rPr>
-              <w:t xml:space="preserve"> n.</w:t>
-            </w:r>
-          </w:p>
-        </w:tc>
-        <w:tc>
-          <w:tcPr>
-            <w:tcW w:w="1724" w:type="pct"/>
-            <w:tcBorders>
-              <w:top w:val="single" w:sz="8" w:space="0" w:color="00647A"/>
-              <w:left w:val="single" w:sz="8" w:space="0" w:color="00647A"/>
-              <w:bottom w:val="single" w:sz="8" w:space="0" w:color="00647A"/>
-              <w:right w:val="single" w:sz="8" w:space="0" w:color="00647A"/>
-            </w:tcBorders>
-            <w:shd w:val="clear" w:color="auto" w:fill="E7EAEC"/>
-            <w:tcMar>
-              <w:top w:w="72" w:type="dxa"/>
-              <w:left w:w="144" w:type="dxa"/>
-              <w:bottom w:w="72" w:type="dxa"/>
-              <w:right w:w="144" w:type="dxa"/>
-            </w:tcMar>
-            <w:hideMark/>
-          </w:tcPr>
-          <w:p>
-            <w:pPr>
-              <w:spacing w:after="0"/>
-            </w:pPr>
+              <w:t>Step</w:t>
+            </w:r>
+            <w:proofErr w:type="spellEnd"/>
             <w:r>
               <w:rPr>
                 <w:b/>
                 <w:bCs/>
                 <w:lang w:val="it-IT"/>
               </w:rPr>
+              <w:t xml:space="preserve"> n.</w:t>
+            </w:r>
+          </w:p>
+        </w:tc>
+        <w:tc>
+          <w:tcPr>
+            <w:tcW w:w="1637" w:type="pct"/>
+            <w:shd w:val="clear" w:color="auto" w:fill="E7EAEC"/>
+            <w:tcMar>
+              <w:top w:w="72" w:type="dxa"/>
+              <w:left w:w="144" w:type="dxa"/>
+              <w:bottom w:w="72" w:type="dxa"/>
+              <w:right w:w="144" w:type="dxa"/>
+            </w:tcMar>
+            <w:hideMark/>
+          </w:tcPr>
+          <w:p>
+            <w:pPr>
+              <w:spacing w:after="0"/>
+            </w:pPr>
+            <w:r>
+              <w:rPr>
+                <w:b/>
+                <w:bCs/>
+                <w:lang w:val="it-IT"/>
+              </w:rPr>
               <w:t>User</w:t>
             </w:r>
           </w:p>
         </w:tc>
         <w:tc>
           <w:tcPr>
-            <w:tcW w:w="1642" w:type="pct"/>
-            <w:tcBorders>
-              <w:top w:val="single" w:sz="8" w:space="0" w:color="00647A"/>
-              <w:left w:val="single" w:sz="8" w:space="0" w:color="00647A"/>
-              <w:bottom w:val="single" w:sz="8" w:space="0" w:color="00647A"/>
-              <w:right w:val="single" w:sz="8" w:space="0" w:color="00647A"/>
-            </w:tcBorders>
+            <w:tcW w:w="1655" w:type="pct"/>
             <w:shd w:val="clear" w:color="auto" w:fill="E7EAEC"/>
             <w:tcMar>
               <w:top w:w="72" w:type="dxa"/>
@@ -800,12 +729,8 @@
         </w:trPr>
         <w:tc>
           <w:tcPr>
-            <w:tcW w:w="1183" w:type="pct"/>
+            <w:tcW w:w="1178" w:type="pct"/>
             <w:vMerge/>
-            <w:tcBorders>
-              <w:left w:val="single" w:sz="8" w:space="0" w:color="00647A"/>
-              <w:right w:val="single" w:sz="8" w:space="0" w:color="00647A"/>
-            </w:tcBorders>
             <w:vAlign w:val="center"/>
             <w:hideMark/>
           </w:tcPr>
@@ -817,13 +742,7 @@
         </w:tc>
         <w:tc>
           <w:tcPr>
-            <w:tcW w:w="451" w:type="pct"/>
-            <w:tcBorders>
-              <w:top w:val="single" w:sz="8" w:space="0" w:color="00647A"/>
-              <w:left w:val="single" w:sz="8" w:space="0" w:color="00647A"/>
-              <w:bottom w:val="single" w:sz="8" w:space="0" w:color="00647A"/>
-              <w:right w:val="single" w:sz="8" w:space="0" w:color="00647A"/>
-            </w:tcBorders>
+            <w:tcW w:w="530" w:type="pct"/>
             <w:tcMar>
               <w:top w:w="72" w:type="dxa"/>
               <w:left w:w="144" w:type="dxa"/>
@@ -843,13 +762,7 @@
         </w:tc>
         <w:tc>
           <w:tcPr>
-            <w:tcW w:w="1724" w:type="pct"/>
-            <w:tcBorders>
-              <w:top w:val="single" w:sz="8" w:space="0" w:color="00647A"/>
-              <w:left w:val="single" w:sz="8" w:space="0" w:color="00647A"/>
-              <w:bottom w:val="single" w:sz="8" w:space="0" w:color="00647A"/>
-              <w:right w:val="single" w:sz="8" w:space="0" w:color="00647A"/>
-            </w:tcBorders>
+            <w:tcW w:w="1637" w:type="pct"/>
             <w:tcMar>
               <w:top w:w="72" w:type="dxa"/>
               <w:left w:w="144" w:type="dxa"/>
@@ -868,13 +781,7 @@
         </w:tc>
         <w:tc>
           <w:tcPr>
-            <w:tcW w:w="1642" w:type="pct"/>
-            <w:tcBorders>
-              <w:top w:val="single" w:sz="8" w:space="0" w:color="00647A"/>
-              <w:left w:val="single" w:sz="8" w:space="0" w:color="00647A"/>
-              <w:bottom w:val="single" w:sz="8" w:space="0" w:color="00647A"/>
-              <w:right w:val="single" w:sz="8" w:space="0" w:color="00647A"/>
-            </w:tcBorders>
+            <w:tcW w:w="1655" w:type="pct"/>
             <w:tcMar>
               <w:top w:w="72" w:type="dxa"/>
               <w:left w:w="144" w:type="dxa"/>
@@ -895,12 +802,8 @@
         </w:trPr>
         <w:tc>
           <w:tcPr>
-            <w:tcW w:w="1183" w:type="pct"/>
+            <w:tcW w:w="1178" w:type="pct"/>
             <w:vMerge/>
-            <w:tcBorders>
-              <w:left w:val="single" w:sz="8" w:space="0" w:color="00647A"/>
-              <w:right w:val="single" w:sz="8" w:space="0" w:color="00647A"/>
-            </w:tcBorders>
             <w:vAlign w:val="center"/>
             <w:hideMark/>
           </w:tcPr>
@@ -912,13 +815,7 @@
         </w:tc>
         <w:tc>
           <w:tcPr>
-            <w:tcW w:w="451" w:type="pct"/>
-            <w:tcBorders>
-              <w:top w:val="single" w:sz="8" w:space="0" w:color="00647A"/>
-              <w:left w:val="single" w:sz="8" w:space="0" w:color="00647A"/>
-              <w:bottom w:val="single" w:sz="8" w:space="0" w:color="00647A"/>
-              <w:right w:val="single" w:sz="8" w:space="0" w:color="00647A"/>
-            </w:tcBorders>
+            <w:tcW w:w="530" w:type="pct"/>
             <w:tcMar>
               <w:top w:w="72" w:type="dxa"/>
               <w:left w:w="144" w:type="dxa"/>
@@ -938,35 +835,23 @@
         </w:tc>
         <w:tc>
           <w:tcPr>
-            <w:tcW w:w="1724" w:type="pct"/>
-            <w:tcBorders>
-              <w:top w:val="single" w:sz="8" w:space="0" w:color="00647A"/>
-              <w:left w:val="single" w:sz="8" w:space="0" w:color="00647A"/>
-              <w:bottom w:val="single" w:sz="8" w:space="0" w:color="00647A"/>
-              <w:right w:val="single" w:sz="8" w:space="0" w:color="00647A"/>
-            </w:tcBorders>
-            <w:tcMar>
-              <w:top w:w="72" w:type="dxa"/>
-              <w:left w:w="144" w:type="dxa"/>
-              <w:bottom w:w="72" w:type="dxa"/>
-              <w:right w:w="144" w:type="dxa"/>
-            </w:tcMar>
-          </w:tcPr>
-          <w:p>
-            <w:pPr>
-              <w:spacing w:after="0"/>
-            </w:pPr>
-          </w:p>
-        </w:tc>
-        <w:tc>
-          <w:tcPr>
-            <w:tcW w:w="1642" w:type="pct"/>
-            <w:tcBorders>
-              <w:top w:val="single" w:sz="8" w:space="0" w:color="00647A"/>
-              <w:left w:val="single" w:sz="8" w:space="0" w:color="00647A"/>
-              <w:bottom w:val="single" w:sz="8" w:space="0" w:color="00647A"/>
-              <w:right w:val="single" w:sz="8" w:space="0" w:color="00647A"/>
-            </w:tcBorders>
+            <w:tcW w:w="1637" w:type="pct"/>
+            <w:tcMar>
+              <w:top w:w="72" w:type="dxa"/>
+              <w:left w:w="144" w:type="dxa"/>
+              <w:bottom w:w="72" w:type="dxa"/>
+              <w:right w:w="144" w:type="dxa"/>
+            </w:tcMar>
+          </w:tcPr>
+          <w:p>
+            <w:pPr>
+              <w:spacing w:after="0"/>
+            </w:pPr>
+          </w:p>
+        </w:tc>
+        <w:tc>
+          <w:tcPr>
+            <w:tcW w:w="1655" w:type="pct"/>
             <w:tcMar>
               <w:top w:w="72" w:type="dxa"/>
               <w:left w:w="144" w:type="dxa"/>
@@ -990,12 +875,8 @@
         </w:trPr>
         <w:tc>
           <w:tcPr>
-            <w:tcW w:w="1183" w:type="pct"/>
+            <w:tcW w:w="1178" w:type="pct"/>
             <w:vMerge/>
-            <w:tcBorders>
-              <w:left w:val="single" w:sz="8" w:space="0" w:color="00647A"/>
-              <w:right w:val="single" w:sz="8" w:space="0" w:color="00647A"/>
-            </w:tcBorders>
             <w:vAlign w:val="center"/>
             <w:hideMark/>
           </w:tcPr>
@@ -1007,13 +888,7 @@
         </w:tc>
         <w:tc>
           <w:tcPr>
-            <w:tcW w:w="451" w:type="pct"/>
-            <w:tcBorders>
-              <w:top w:val="single" w:sz="8" w:space="0" w:color="00647A"/>
-              <w:left w:val="single" w:sz="8" w:space="0" w:color="00647A"/>
-              <w:bottom w:val="single" w:sz="8" w:space="0" w:color="00647A"/>
-              <w:right w:val="single" w:sz="8" w:space="0" w:color="00647A"/>
-            </w:tcBorders>
+            <w:tcW w:w="530" w:type="pct"/>
             <w:tcMar>
               <w:top w:w="72" w:type="dxa"/>
               <w:left w:w="144" w:type="dxa"/>
@@ -1033,38 +908,26 @@
         </w:tc>
         <w:tc>
           <w:tcPr>
-            <w:tcW w:w="1724" w:type="pct"/>
-            <w:tcBorders>
-              <w:top w:val="single" w:sz="8" w:space="0" w:color="00647A"/>
-              <w:left w:val="single" w:sz="8" w:space="0" w:color="00647A"/>
-              <w:bottom w:val="single" w:sz="8" w:space="0" w:color="00647A"/>
-              <w:right w:val="single" w:sz="8" w:space="0" w:color="00647A"/>
-            </w:tcBorders>
-            <w:tcMar>
-              <w:top w:w="72" w:type="dxa"/>
-              <w:left w:w="144" w:type="dxa"/>
-              <w:bottom w:w="72" w:type="dxa"/>
-              <w:right w:w="144" w:type="dxa"/>
-            </w:tcMar>
-          </w:tcPr>
-          <w:p>
-            <w:pPr>
-              <w:spacing w:after="0"/>
-            </w:pPr>
-            <w:r>
-              <w:t>Enters the Title into the corresponding text field</w:t>
-            </w:r>
-          </w:p>
-        </w:tc>
-        <w:tc>
-          <w:tcPr>
-            <w:tcW w:w="1642" w:type="pct"/>
-            <w:tcBorders>
-              <w:top w:val="single" w:sz="8" w:space="0" w:color="00647A"/>
-              <w:left w:val="single" w:sz="8" w:space="0" w:color="00647A"/>
-              <w:bottom w:val="single" w:sz="8" w:space="0" w:color="00647A"/>
-              <w:right w:val="single" w:sz="8" w:space="0" w:color="00647A"/>
-            </w:tcBorders>
+            <w:tcW w:w="1637" w:type="pct"/>
+            <w:tcMar>
+              <w:top w:w="72" w:type="dxa"/>
+              <w:left w:w="144" w:type="dxa"/>
+              <w:bottom w:w="72" w:type="dxa"/>
+              <w:right w:w="144" w:type="dxa"/>
+            </w:tcMar>
+          </w:tcPr>
+          <w:p>
+            <w:pPr>
+              <w:spacing w:after="0"/>
+            </w:pPr>
+            <w:r>
+              <w:t>Enters the Title (mandatory) into the corresponding text field; Then enters priority level, a description (both optional)</w:t>
+            </w:r>
+          </w:p>
+        </w:tc>
+        <w:tc>
+          <w:tcPr>
+            <w:tcW w:w="1655" w:type="pct"/>
             <w:tcMar>
               <w:top w:w="72" w:type="dxa"/>
               <w:left w:w="144" w:type="dxa"/>
@@ -1085,40 +948,25 @@
         </w:trPr>
         <w:tc>
           <w:tcPr>
-            <w:tcW w:w="1183" w:type="pct"/>
+            <w:tcW w:w="1178" w:type="pct"/>
             <w:vMerge/>
-            <w:tcBorders>
-              <w:left w:val="single" w:sz="8" w:space="0" w:color="00647A"/>
-              <w:right w:val="single" w:sz="8" w:space="0" w:color="00647A"/>
-            </w:tcBorders>
             <w:vAlign w:val="center"/>
-            <w:hideMark/>
-          </w:tcPr>
-          <w:p>
-            <w:pPr>
-              <w:spacing w:after="0"/>
-              <w:rPr>
-                <w:lang w:val="en-US"/>
-              </w:rPr>
-            </w:pPr>
-          </w:p>
-        </w:tc>
-        <w:tc>
-          <w:tcPr>
-            <w:tcW w:w="451" w:type="pct"/>
-            <w:tcBorders>
-              <w:top w:val="single" w:sz="8" w:space="0" w:color="00647A"/>
-              <w:left w:val="single" w:sz="8" w:space="0" w:color="00647A"/>
-              <w:bottom w:val="single" w:sz="8" w:space="0" w:color="00647A"/>
-              <w:right w:val="single" w:sz="8" w:space="0" w:color="00647A"/>
-            </w:tcBorders>
-            <w:tcMar>
-              <w:top w:w="72" w:type="dxa"/>
-              <w:left w:w="144" w:type="dxa"/>
-              <w:bottom w:w="72" w:type="dxa"/>
-              <w:right w:w="144" w:type="dxa"/>
-            </w:tcMar>
-            <w:hideMark/>
+          </w:tcPr>
+          <w:p>
+            <w:pPr>
+              <w:spacing w:after="0"/>
+            </w:pPr>
+          </w:p>
+        </w:tc>
+        <w:tc>
+          <w:tcPr>
+            <w:tcW w:w="530" w:type="pct"/>
+            <w:tcMar>
+              <w:top w:w="72" w:type="dxa"/>
+              <w:left w:w="144" w:type="dxa"/>
+              <w:bottom w:w="72" w:type="dxa"/>
+              <w:right w:w="144" w:type="dxa"/>
+            </w:tcMar>
           </w:tcPr>
           <w:p>
             <w:pPr>
@@ -1131,38 +979,44 @@
         </w:tc>
         <w:tc>
           <w:tcPr>
-            <w:tcW w:w="1724" w:type="pct"/>
-            <w:tcBorders>
-              <w:top w:val="single" w:sz="8" w:space="0" w:color="00647A"/>
-              <w:left w:val="single" w:sz="8" w:space="0" w:color="00647A"/>
-              <w:bottom w:val="single" w:sz="8" w:space="0" w:color="00647A"/>
-              <w:right w:val="single" w:sz="8" w:space="0" w:color="00647A"/>
-            </w:tcBorders>
-            <w:tcMar>
-              <w:top w:w="72" w:type="dxa"/>
-              <w:left w:w="144" w:type="dxa"/>
-              <w:bottom w:w="72" w:type="dxa"/>
-              <w:right w:w="144" w:type="dxa"/>
-            </w:tcMar>
-          </w:tcPr>
-          <w:p>
-            <w:pPr>
-              <w:spacing w:after="0"/>
-            </w:pPr>
-            <w:r>
-              <w:t>Clicks the “Submit” button to confirm the operation</w:t>
-            </w:r>
-          </w:p>
-        </w:tc>
-        <w:tc>
-          <w:tcPr>
-            <w:tcW w:w="1642" w:type="pct"/>
-            <w:tcBorders>
-              <w:top w:val="single" w:sz="8" w:space="0" w:color="00647A"/>
-              <w:left w:val="single" w:sz="8" w:space="0" w:color="00647A"/>
-              <w:bottom w:val="single" w:sz="8" w:space="0" w:color="00647A"/>
-              <w:right w:val="single" w:sz="8" w:space="0" w:color="00647A"/>
-            </w:tcBorders>
+            <w:tcW w:w="1637" w:type="pct"/>
+            <w:tcMar>
+              <w:top w:w="72" w:type="dxa"/>
+              <w:left w:w="144" w:type="dxa"/>
+              <w:bottom w:w="72" w:type="dxa"/>
+              <w:right w:w="144" w:type="dxa"/>
+            </w:tcMar>
+          </w:tcPr>
+          <w:p>
+            <w:pPr>
+              <w:spacing w:after="0"/>
+            </w:pPr>
+            <w:r>
+              <w:t xml:space="preserve">[EXTENSION] Select </w:t>
+            </w:r>
+            <w:r>
+              <w:t>a</w:t>
+            </w:r>
+            <w:r>
+              <w:t>n</w:t>
+            </w:r>
+            <w:r>
+              <w:t xml:space="preserve"> </w:t>
+            </w:r>
+            <w:r>
+              <w:t xml:space="preserve">image file </w:t>
+            </w:r>
+            <w:r>
+              <w:t>of the issue</w:t>
+            </w:r>
+            <w:r>
+              <w:t xml:space="preserve"> to upload</w:t>
+            </w:r>
+          </w:p>
+        </w:tc>
+        <w:tc>
+          <w:tcPr>
+            <w:tcW w:w="1655" w:type="pct"/>
             <w:tcMar>
               <w:top w:w="72" w:type="dxa"/>
               <w:left w:w="144" w:type="dxa"/>
@@ -1183,30 +1037,23 @@
         </w:trPr>
         <w:tc>
           <w:tcPr>
-            <w:tcW w:w="1183" w:type="pct"/>
+            <w:tcW w:w="1178" w:type="pct"/>
             <w:vMerge/>
-            <w:tcBorders>
-              <w:left w:val="single" w:sz="8" w:space="0" w:color="00647A"/>
-              <w:right w:val="single" w:sz="8" w:space="0" w:color="00647A"/>
-            </w:tcBorders>
             <w:vAlign w:val="center"/>
             <w:hideMark/>
           </w:tcPr>
           <w:p>
             <w:pPr>
               <w:spacing w:after="0"/>
-            </w:pPr>
-          </w:p>
-        </w:tc>
-        <w:tc>
-          <w:tcPr>
-            <w:tcW w:w="451" w:type="pct"/>
-            <w:tcBorders>
-              <w:top w:val="single" w:sz="8" w:space="0" w:color="00647A"/>
-              <w:left w:val="single" w:sz="8" w:space="0" w:color="00647A"/>
-              <w:bottom w:val="single" w:sz="8" w:space="0" w:color="00647A"/>
-              <w:right w:val="single" w:sz="8" w:space="0" w:color="00647A"/>
-            </w:tcBorders>
+              <w:rPr>
+                <w:lang w:val="en-US"/>
+              </w:rPr>
+            </w:pPr>
+          </w:p>
+        </w:tc>
+        <w:tc>
+          <w:tcPr>
+            <w:tcW w:w="530" w:type="pct"/>
             <w:tcMar>
               <w:top w:w="72" w:type="dxa"/>
               <w:left w:w="144" w:type="dxa"/>
@@ -1226,48 +1073,36 @@
         </w:tc>
         <w:tc>
           <w:tcPr>
-            <w:tcW w:w="1724" w:type="pct"/>
-            <w:tcBorders>
-              <w:top w:val="single" w:sz="8" w:space="0" w:color="00647A"/>
-              <w:left w:val="single" w:sz="8" w:space="0" w:color="00647A"/>
-              <w:bottom w:val="single" w:sz="8" w:space="0" w:color="00647A"/>
-              <w:right w:val="single" w:sz="8" w:space="0" w:color="00647A"/>
-            </w:tcBorders>
-            <w:tcMar>
-              <w:top w:w="72" w:type="dxa"/>
-              <w:left w:w="144" w:type="dxa"/>
-              <w:bottom w:w="72" w:type="dxa"/>
-              <w:right w:w="144" w:type="dxa"/>
-            </w:tcMar>
-          </w:tcPr>
-          <w:p>
-            <w:pPr>
-              <w:spacing w:after="0"/>
-            </w:pPr>
-          </w:p>
-        </w:tc>
-        <w:tc>
-          <w:tcPr>
-            <w:tcW w:w="1642" w:type="pct"/>
-            <w:tcBorders>
-              <w:top w:val="single" w:sz="8" w:space="0" w:color="00647A"/>
-              <w:left w:val="single" w:sz="8" w:space="0" w:color="00647A"/>
-              <w:bottom w:val="single" w:sz="8" w:space="0" w:color="00647A"/>
-              <w:right w:val="single" w:sz="8" w:space="0" w:color="00647A"/>
-            </w:tcBorders>
-            <w:tcMar>
-              <w:top w:w="72" w:type="dxa"/>
-              <w:left w:w="144" w:type="dxa"/>
-              <w:bottom w:w="72" w:type="dxa"/>
-              <w:right w:w="144" w:type="dxa"/>
-            </w:tcMar>
-          </w:tcPr>
-          <w:p>
-            <w:pPr>
-              <w:spacing w:after="0"/>
-            </w:pPr>
-            <w:r>
-              <w:t>Validates that the title meets the length requirement (&gt; 10 chars)</w:t>
+            <w:tcW w:w="1637" w:type="pct"/>
+            <w:tcMar>
+              <w:top w:w="72" w:type="dxa"/>
+              <w:left w:w="144" w:type="dxa"/>
+              <w:bottom w:w="72" w:type="dxa"/>
+              <w:right w:w="144" w:type="dxa"/>
+            </w:tcMar>
+          </w:tcPr>
+          <w:p>
+            <w:pPr>
+              <w:spacing w:after="0"/>
+            </w:pPr>
+          </w:p>
+        </w:tc>
+        <w:tc>
+          <w:tcPr>
+            <w:tcW w:w="1655" w:type="pct"/>
+            <w:tcMar>
+              <w:top w:w="72" w:type="dxa"/>
+              <w:left w:w="144" w:type="dxa"/>
+              <w:bottom w:w="72" w:type="dxa"/>
+              <w:right w:w="144" w:type="dxa"/>
+            </w:tcMar>
+          </w:tcPr>
+          <w:p>
+            <w:pPr>
+              <w:spacing w:after="0"/>
+            </w:pPr>
+            <w:r>
+              <w:t>[EXTENSION] Checks if the attachment is both &lt;5MB and the correct format (JPG/PNG)</w:t>
             </w:r>
           </w:p>
         </w:tc>
@@ -1278,38 +1113,27 @@
         </w:trPr>
         <w:tc>
           <w:tcPr>
-            <w:tcW w:w="1183" w:type="pct"/>
+            <w:tcW w:w="1178" w:type="pct"/>
             <w:vMerge/>
-            <w:tcBorders>
-              <w:left w:val="single" w:sz="8" w:space="0" w:color="00647A"/>
-              <w:right w:val="single" w:sz="8" w:space="0" w:color="00647A"/>
-            </w:tcBorders>
             <w:vAlign w:val="center"/>
-          </w:tcPr>
-          <w:p>
-            <w:pPr>
-              <w:spacing w:after="0"/>
-              <w:rPr>
-                <w:lang w:val="en-US"/>
-              </w:rPr>
-            </w:pPr>
-          </w:p>
-        </w:tc>
-        <w:tc>
-          <w:tcPr>
-            <w:tcW w:w="451" w:type="pct"/>
-            <w:tcBorders>
-              <w:top w:val="single" w:sz="8" w:space="0" w:color="00647A"/>
-              <w:left w:val="single" w:sz="8" w:space="0" w:color="00647A"/>
-              <w:bottom w:val="single" w:sz="8" w:space="0" w:color="00647A"/>
-              <w:right w:val="single" w:sz="8" w:space="0" w:color="00647A"/>
-            </w:tcBorders>
-            <w:tcMar>
-              <w:top w:w="72" w:type="dxa"/>
-              <w:left w:w="144" w:type="dxa"/>
-              <w:bottom w:w="72" w:type="dxa"/>
-              <w:right w:w="144" w:type="dxa"/>
-            </w:tcMar>
+            <w:hideMark/>
+          </w:tcPr>
+          <w:p>
+            <w:pPr>
+              <w:spacing w:after="0"/>
+            </w:pPr>
+          </w:p>
+        </w:tc>
+        <w:tc>
+          <w:tcPr>
+            <w:tcW w:w="530" w:type="pct"/>
+            <w:tcMar>
+              <w:top w:w="72" w:type="dxa"/>
+              <w:left w:w="144" w:type="dxa"/>
+              <w:bottom w:w="72" w:type="dxa"/>
+              <w:right w:w="144" w:type="dxa"/>
+            </w:tcMar>
+            <w:hideMark/>
           </w:tcPr>
           <w:p>
             <w:pPr>
@@ -1322,52 +1146,37 @@
         </w:tc>
         <w:tc>
           <w:tcPr>
-            <w:tcW w:w="1724" w:type="pct"/>
-            <w:tcBorders>
-              <w:top w:val="single" w:sz="8" w:space="0" w:color="00647A"/>
-              <w:left w:val="single" w:sz="8" w:space="0" w:color="00647A"/>
-              <w:bottom w:val="single" w:sz="8" w:space="0" w:color="00647A"/>
-              <w:right w:val="single" w:sz="8" w:space="0" w:color="00647A"/>
-            </w:tcBorders>
-            <w:tcMar>
-              <w:top w:w="72" w:type="dxa"/>
-              <w:left w:w="144" w:type="dxa"/>
-              <w:bottom w:w="72" w:type="dxa"/>
-              <w:right w:w="144" w:type="dxa"/>
-            </w:tcMar>
-          </w:tcPr>
-          <w:p>
-            <w:pPr>
-              <w:spacing w:after="0"/>
-            </w:pPr>
-          </w:p>
-        </w:tc>
-        <w:tc>
-          <w:tcPr>
-            <w:tcW w:w="1642" w:type="pct"/>
-            <w:tcBorders>
-              <w:top w:val="single" w:sz="8" w:space="0" w:color="00647A"/>
-              <w:left w:val="single" w:sz="8" w:space="0" w:color="00647A"/>
-              <w:bottom w:val="single" w:sz="8" w:space="0" w:color="00647A"/>
-              <w:right w:val="single" w:sz="8" w:space="0" w:color="00647A"/>
-            </w:tcBorders>
-            <w:tcMar>
-              <w:top w:w="72" w:type="dxa"/>
-              <w:left w:w="144" w:type="dxa"/>
-              <w:bottom w:w="72" w:type="dxa"/>
-              <w:right w:w="144" w:type="dxa"/>
-            </w:tcMar>
-          </w:tcPr>
-          <w:p>
-            <w:pPr>
-              <w:spacing w:after="0"/>
-            </w:pPr>
-            <w:r>
-              <w:t>Saves</w:t>
-            </w:r>
-            <w:r>
-              <w:t xml:space="preserve"> the new issue in the database with a unique ID and status “TODO”</w:t>
-            </w:r>
+            <w:tcW w:w="1637" w:type="pct"/>
+            <w:tcMar>
+              <w:top w:w="72" w:type="dxa"/>
+              <w:left w:w="144" w:type="dxa"/>
+              <w:bottom w:w="72" w:type="dxa"/>
+              <w:right w:w="144" w:type="dxa"/>
+            </w:tcMar>
+          </w:tcPr>
+          <w:p>
+            <w:pPr>
+              <w:spacing w:after="0"/>
+            </w:pPr>
+            <w:r>
+              <w:t>Clicks the “Submit” button to confirm the operation</w:t>
+            </w:r>
+          </w:p>
+        </w:tc>
+        <w:tc>
+          <w:tcPr>
+            <w:tcW w:w="1655" w:type="pct"/>
+            <w:tcMar>
+              <w:top w:w="72" w:type="dxa"/>
+              <w:left w:w="144" w:type="dxa"/>
+              <w:bottom w:w="72" w:type="dxa"/>
+              <w:right w:w="144" w:type="dxa"/>
+            </w:tcMar>
+          </w:tcPr>
+          <w:p>
+            <w:pPr>
+              <w:spacing w:after="0"/>
+            </w:pPr>
           </w:p>
         </w:tc>
       </w:tr>
@@ -1377,12 +1186,8 @@
         </w:trPr>
         <w:tc>
           <w:tcPr>
-            <w:tcW w:w="1183" w:type="pct"/>
+            <w:tcW w:w="1178" w:type="pct"/>
             <w:vMerge/>
-            <w:tcBorders>
-              <w:left w:val="single" w:sz="8" w:space="0" w:color="00647A"/>
-              <w:right w:val="single" w:sz="8" w:space="0" w:color="00647A"/>
-            </w:tcBorders>
             <w:vAlign w:val="center"/>
           </w:tcPr>
           <w:p>
@@ -1396,13 +1201,7 @@
         </w:tc>
         <w:tc>
           <w:tcPr>
-            <w:tcW w:w="451" w:type="pct"/>
-            <w:tcBorders>
-              <w:top w:val="single" w:sz="8" w:space="0" w:color="00647A"/>
-              <w:left w:val="single" w:sz="8" w:space="0" w:color="00647A"/>
-              <w:bottom w:val="single" w:sz="8" w:space="0" w:color="00647A"/>
-              <w:right w:val="single" w:sz="8" w:space="0" w:color="00647A"/>
-            </w:tcBorders>
+            <w:tcW w:w="530" w:type="pct"/>
             <w:tcMar>
               <w:top w:w="72" w:type="dxa"/>
               <w:left w:w="144" w:type="dxa"/>
@@ -1421,51 +1220,37 @@
         </w:tc>
         <w:tc>
           <w:tcPr>
-            <w:tcW w:w="1724" w:type="pct"/>
-            <w:tcBorders>
-              <w:top w:val="single" w:sz="8" w:space="0" w:color="00647A"/>
-              <w:left w:val="single" w:sz="8" w:space="0" w:color="00647A"/>
-              <w:bottom w:val="single" w:sz="8" w:space="0" w:color="00647A"/>
-              <w:right w:val="single" w:sz="8" w:space="0" w:color="00647A"/>
-            </w:tcBorders>
-            <w:tcMar>
-              <w:top w:w="72" w:type="dxa"/>
-              <w:left w:w="144" w:type="dxa"/>
-              <w:bottom w:w="72" w:type="dxa"/>
-              <w:right w:w="144" w:type="dxa"/>
-            </w:tcMar>
-          </w:tcPr>
-          <w:p>
-            <w:pPr>
-              <w:spacing w:after="0"/>
-            </w:pPr>
-          </w:p>
-        </w:tc>
-        <w:tc>
-          <w:tcPr>
-            <w:tcW w:w="1642" w:type="pct"/>
-            <w:tcBorders>
-              <w:top w:val="single" w:sz="8" w:space="0" w:color="00647A"/>
-              <w:left w:val="single" w:sz="8" w:space="0" w:color="00647A"/>
-              <w:bottom w:val="single" w:sz="8" w:space="0" w:color="00647A"/>
-              <w:right w:val="single" w:sz="8" w:space="0" w:color="00647A"/>
-            </w:tcBorders>
-            <w:tcMar>
-              <w:top w:w="72" w:type="dxa"/>
-              <w:left w:w="144" w:type="dxa"/>
-              <w:bottom w:w="72" w:type="dxa"/>
-              <w:right w:w="144" w:type="dxa"/>
-            </w:tcMar>
-          </w:tcPr>
-          <w:p>
-            <w:pPr>
-              <w:spacing w:after="0"/>
-            </w:pPr>
-            <w:r>
-              <w:t>Displays a success notification (“Issue created successfully”) to the User</w:t>
-            </w:r>
-            <w:bookmarkStart w:id="0" w:name="_GoBack"/>
-            <w:bookmarkEnd w:id="0"/>
+            <w:tcW w:w="1637" w:type="pct"/>
+            <w:tcMar>
+              <w:top w:w="72" w:type="dxa"/>
+              <w:left w:w="144" w:type="dxa"/>
+              <w:bottom w:w="72" w:type="dxa"/>
+              <w:right w:w="144" w:type="dxa"/>
+            </w:tcMar>
+          </w:tcPr>
+          <w:p>
+            <w:pPr>
+              <w:spacing w:after="0"/>
+            </w:pPr>
+          </w:p>
+        </w:tc>
+        <w:tc>
+          <w:tcPr>
+            <w:tcW w:w="1655" w:type="pct"/>
+            <w:tcMar>
+              <w:top w:w="72" w:type="dxa"/>
+              <w:left w:w="144" w:type="dxa"/>
+              <w:bottom w:w="72" w:type="dxa"/>
+              <w:right w:w="144" w:type="dxa"/>
+            </w:tcMar>
+          </w:tcPr>
+          <w:p>
+            <w:pPr>
+              <w:spacing w:after="0"/>
+            </w:pPr>
+            <w:r>
+              <w:t xml:space="preserve">Validates that the title meets the length requirement (&gt; 10 chars) </w:t>
+            </w:r>
           </w:p>
         </w:tc>
       </w:tr>
@@ -1475,12 +1260,8 @@
         </w:trPr>
         <w:tc>
           <w:tcPr>
-            <w:tcW w:w="1183" w:type="pct"/>
+            <w:tcW w:w="1178" w:type="pct"/>
             <w:vMerge/>
-            <w:tcBorders>
-              <w:left w:val="single" w:sz="8" w:space="0" w:color="00647A"/>
-              <w:right w:val="single" w:sz="8" w:space="0" w:color="00647A"/>
-            </w:tcBorders>
             <w:vAlign w:val="center"/>
           </w:tcPr>
           <w:p>
@@ -1494,13 +1275,7 @@
         </w:tc>
         <w:tc>
           <w:tcPr>
-            <w:tcW w:w="451" w:type="pct"/>
-            <w:tcBorders>
-              <w:top w:val="single" w:sz="8" w:space="0" w:color="00647A"/>
-              <w:left w:val="single" w:sz="8" w:space="0" w:color="00647A"/>
-              <w:bottom w:val="single" w:sz="8" w:space="0" w:color="00647A"/>
-              <w:right w:val="single" w:sz="8" w:space="0" w:color="00647A"/>
-            </w:tcBorders>
+            <w:tcW w:w="530" w:type="pct"/>
             <w:tcMar>
               <w:top w:w="72" w:type="dxa"/>
               <w:left w:w="144" w:type="dxa"/>
@@ -1519,46 +1294,37 @@
         </w:tc>
         <w:tc>
           <w:tcPr>
-            <w:tcW w:w="1724" w:type="pct"/>
-            <w:tcBorders>
-              <w:top w:val="single" w:sz="8" w:space="0" w:color="00647A"/>
-              <w:left w:val="single" w:sz="8" w:space="0" w:color="00647A"/>
-              <w:bottom w:val="single" w:sz="8" w:space="0" w:color="00647A"/>
-              <w:right w:val="single" w:sz="8" w:space="0" w:color="00647A"/>
-            </w:tcBorders>
-            <w:tcMar>
-              <w:top w:w="72" w:type="dxa"/>
-              <w:left w:w="144" w:type="dxa"/>
-              <w:bottom w:w="72" w:type="dxa"/>
-              <w:right w:w="144" w:type="dxa"/>
-            </w:tcMar>
-          </w:tcPr>
-          <w:p>
-            <w:pPr>
-              <w:spacing w:after="0"/>
-            </w:pPr>
-          </w:p>
-        </w:tc>
-        <w:tc>
-          <w:tcPr>
-            <w:tcW w:w="1642" w:type="pct"/>
-            <w:tcBorders>
-              <w:top w:val="single" w:sz="8" w:space="0" w:color="00647A"/>
-              <w:left w:val="single" w:sz="8" w:space="0" w:color="00647A"/>
-              <w:bottom w:val="single" w:sz="8" w:space="0" w:color="00647A"/>
-              <w:right w:val="single" w:sz="8" w:space="0" w:color="00647A"/>
-            </w:tcBorders>
-            <w:tcMar>
-              <w:top w:w="72" w:type="dxa"/>
-              <w:left w:w="144" w:type="dxa"/>
-              <w:bottom w:w="72" w:type="dxa"/>
-              <w:right w:w="144" w:type="dxa"/>
-            </w:tcMar>
-          </w:tcPr>
-          <w:p>
-            <w:pPr>
-              <w:spacing w:after="0"/>
-            </w:pPr>
+            <w:tcW w:w="1637" w:type="pct"/>
+            <w:tcMar>
+              <w:top w:w="72" w:type="dxa"/>
+              <w:left w:w="144" w:type="dxa"/>
+              <w:bottom w:w="72" w:type="dxa"/>
+              <w:right w:w="144" w:type="dxa"/>
+            </w:tcMar>
+          </w:tcPr>
+          <w:p>
+            <w:pPr>
+              <w:spacing w:after="0"/>
+            </w:pPr>
+          </w:p>
+        </w:tc>
+        <w:tc>
+          <w:tcPr>
+            <w:tcW w:w="1655" w:type="pct"/>
+            <w:tcMar>
+              <w:top w:w="72" w:type="dxa"/>
+              <w:left w:w="144" w:type="dxa"/>
+              <w:bottom w:w="72" w:type="dxa"/>
+              <w:right w:w="144" w:type="dxa"/>
+            </w:tcMar>
+          </w:tcPr>
+          <w:p>
+            <w:pPr>
+              <w:spacing w:after="0"/>
+            </w:pPr>
+            <w:r>
+              <w:t>Saves the new issue in the database with a unique ID and status “TODO”</w:t>
+            </w:r>
           </w:p>
         </w:tc>
       </w:tr>
@@ -1568,9 +1334,108 @@
         </w:trPr>
         <w:tc>
           <w:tcPr>
+            <w:tcW w:w="1178" w:type="pct"/>
+            <w:vMerge/>
+            <w:vAlign w:val="center"/>
+          </w:tcPr>
+          <w:p>
+            <w:pPr>
+              <w:spacing w:after="0"/>
+              <w:rPr>
+                <w:lang w:val="en-US"/>
+              </w:rPr>
+            </w:pPr>
+          </w:p>
+        </w:tc>
+        <w:tc>
+          <w:tcPr>
+            <w:tcW w:w="530" w:type="pct"/>
+            <w:tcMar>
+              <w:top w:w="72" w:type="dxa"/>
+              <w:left w:w="144" w:type="dxa"/>
+              <w:bottom w:w="72" w:type="dxa"/>
+              <w:right w:w="144" w:type="dxa"/>
+            </w:tcMar>
+          </w:tcPr>
+          <w:p>
+            <w:pPr>
+              <w:spacing w:after="0"/>
+            </w:pPr>
+            <w:r>
+              <w:t>9</w:t>
+            </w:r>
+          </w:p>
+        </w:tc>
+        <w:tc>
+          <w:tcPr>
+            <w:tcW w:w="1637" w:type="pct"/>
+            <w:tcMar>
+              <w:top w:w="72" w:type="dxa"/>
+              <w:left w:w="144" w:type="dxa"/>
+              <w:bottom w:w="72" w:type="dxa"/>
+              <w:right w:w="144" w:type="dxa"/>
+            </w:tcMar>
+          </w:tcPr>
+          <w:p>
+            <w:pPr>
+              <w:spacing w:after="0"/>
+            </w:pPr>
+          </w:p>
+        </w:tc>
+        <w:tc>
+          <w:tcPr>
+            <w:tcW w:w="1655" w:type="pct"/>
+            <w:tcMar>
+              <w:top w:w="72" w:type="dxa"/>
+              <w:left w:w="144" w:type="dxa"/>
+              <w:bottom w:w="72" w:type="dxa"/>
+              <w:right w:w="144" w:type="dxa"/>
+            </w:tcMar>
+          </w:tcPr>
+          <w:p>
+            <w:pPr>
+              <w:spacing w:after="0"/>
+            </w:pPr>
+            <w:r>
+              <w:t>Displays a success notification (“Issue created successfully”) to the User</w:t>
+            </w:r>
+          </w:p>
+        </w:tc>
+      </w:tr>
+    </w:tbl>
+    <w:p/>
+    <w:p>
+      <w:r>
+        <w:br w:type="page"/>
+      </w:r>
+    </w:p>
+    <w:p/>
+    <w:tbl>
+      <w:tblPr>
+        <w:tblW w:w="5000" w:type="pct"/>
+        <w:tblInd w:w="-134" w:type="dxa"/>
+        <w:tblCellMar>
+          <w:left w:w="0" w:type="dxa"/>
+          <w:right w:w="0" w:type="dxa"/>
+        </w:tblCellMar>
+        <w:tblLook w:val="04A0" w:firstRow="1" w:lastRow="0" w:firstColumn="1" w:lastColumn="0" w:noHBand="0" w:noVBand="1"/>
+      </w:tblPr>
+      <w:tblGrid>
+        <w:gridCol w:w="2317"/>
+        <w:gridCol w:w="883"/>
+        <w:gridCol w:w="3376"/>
+        <w:gridCol w:w="3216"/>
+      </w:tblGrid>
+      <w:tr>
+        <w:trPr>
+          <w:trHeight w:val="20"/>
+        </w:trPr>
+        <w:tc>
+          <w:tcPr>
             <w:tcW w:w="1183" w:type="pct"/>
-            <w:vMerge/>
-            <w:tcBorders>
+            <w:vMerge w:val="restart"/>
+            <w:tcBorders>
+              <w:top w:val="single" w:sz="8" w:space="0" w:color="00647A"/>
               <w:left w:val="single" w:sz="8" w:space="0" w:color="00647A"/>
               <w:right w:val="single" w:sz="8" w:space="0" w:color="00647A"/>
             </w:tcBorders>
@@ -1578,11 +1443,26 @@
           </w:tcPr>
           <w:p>
             <w:pPr>
-              <w:spacing w:after="0"/>
-              <w:rPr>
-                <w:lang w:val="it-IT"/>
-              </w:rPr>
-            </w:pPr>
+              <w:spacing w:after="0" w:line="360" w:lineRule="auto"/>
+              <w:jc w:val="both"/>
+              <w:rPr>
+                <w:lang w:val="en-US"/>
+              </w:rPr>
+            </w:pPr>
+            <w:r>
+              <w:rPr>
+                <w:lang w:val="it-IT"/>
+              </w:rPr>
+              <w:t xml:space="preserve">Extension 3a: </w:t>
+            </w:r>
+            <w:proofErr w:type="spellStart"/>
+            <w:r>
+              <w:rPr>
+                <w:lang w:val="it-IT"/>
+              </w:rPr>
+              <w:t>Description</w:t>
+            </w:r>
+            <w:proofErr w:type="spellEnd"/>
           </w:p>
         </w:tc>
         <w:tc>
@@ -1606,7 +1486,10 @@
               <w:spacing w:after="0"/>
             </w:pPr>
             <w:r>
-              <w:t>9</w:t>
+              <w:rPr>
+                <w:lang w:val="it-IT"/>
+              </w:rPr>
+              <w:t>3a1</w:t>
             </w:r>
           </w:p>
         </w:tc>
@@ -1630,6 +1513,34 @@
             <w:pPr>
               <w:spacing w:after="0"/>
             </w:pPr>
+            <w:proofErr w:type="spellStart"/>
+            <w:r>
+              <w:rPr>
+                <w:lang w:val="it-IT"/>
+              </w:rPr>
+              <w:t>Clicks</w:t>
+            </w:r>
+            <w:proofErr w:type="spellEnd"/>
+            <w:r>
+              <w:rPr>
+                <w:lang w:val="it-IT"/>
+              </w:rPr>
+              <w:t xml:space="preserve"> “</w:t>
+            </w:r>
+            <w:proofErr w:type="spellStart"/>
+            <w:r>
+              <w:rPr>
+                <w:lang w:val="it-IT"/>
+              </w:rPr>
+              <w:t>Cancel</w:t>
+            </w:r>
+            <w:proofErr w:type="spellEnd"/>
+            <w:r>
+              <w:rPr>
+                <w:lang w:val="it-IT"/>
+              </w:rPr>
+              <w:t>”</w:t>
+            </w:r>
           </w:p>
         </w:tc>
         <w:tc>
@@ -1705,7 +1616,7 @@
               <w:rPr>
                 <w:lang w:val="it-IT"/>
               </w:rPr>
-              <w:t>10</w:t>
+              <w:t>3a2</w:t>
             </w:r>
           </w:p>
         </w:tc>
@@ -1754,9 +1665,21 @@
             <w:pPr>
               <w:spacing w:after="0"/>
               <w:rPr>
-                <w:lang w:val="it-IT"/>
-              </w:rPr>
-            </w:pPr>
+                <w:lang w:val="en-US"/>
+              </w:rPr>
+            </w:pPr>
+            <w:r>
+              <w:rPr>
+                <w:lang w:val="en-US"/>
+              </w:rPr>
+              <w:t>Discards data and returns t</w:t>
+            </w:r>
+            <w:r>
+              <w:rPr>
+                <w:lang w:val="en-US"/>
+              </w:rPr>
+              <w:t>o the previous view (the board)</w:t>
+            </w:r>
           </w:p>
         </w:tc>
       </w:tr>
@@ -1767,10 +1690,10 @@
         <w:tc>
           <w:tcPr>
             <w:tcW w:w="1183" w:type="pct"/>
-            <w:vMerge/>
-            <w:tcBorders>
-              <w:left w:val="single" w:sz="8" w:space="0" w:color="00647A"/>
-              <w:bottom w:val="single" w:sz="8" w:space="0" w:color="00647A"/>
+            <w:vMerge w:val="restart"/>
+            <w:tcBorders>
+              <w:top w:val="single" w:sz="8" w:space="0" w:color="00647A"/>
+              <w:left w:val="single" w:sz="8" w:space="0" w:color="00647A"/>
               <w:right w:val="single" w:sz="8" w:space="0" w:color="00647A"/>
             </w:tcBorders>
             <w:vAlign w:val="center"/>
@@ -1779,9 +1702,21 @@
             <w:pPr>
               <w:spacing w:after="0"/>
               <w:rPr>
-                <w:lang w:val="it-IT"/>
-              </w:rPr>
-            </w:pPr>
+                <w:lang w:val="en-US"/>
+              </w:rPr>
+            </w:pPr>
+            <w:r>
+              <w:rPr>
+                <w:lang w:val="en-US"/>
+              </w:rPr>
+              <w:t>Extension 5</w:t>
+            </w:r>
+            <w:r>
+              <w:rPr>
+                <w:lang w:val="en-US"/>
+              </w:rPr>
+              <w:t>a: Description</w:t>
+            </w:r>
           </w:p>
         </w:tc>
         <w:tc>
@@ -1804,14 +1739,20 @@
             <w:pPr>
               <w:spacing w:after="0"/>
               <w:rPr>
-                <w:lang w:val="it-IT"/>
-              </w:rPr>
-            </w:pPr>
-            <w:r>
-              <w:rPr>
-                <w:lang w:val="it-IT"/>
-              </w:rPr>
-              <w:t>11</w:t>
+                <w:lang w:val="en-US"/>
+              </w:rPr>
+            </w:pPr>
+            <w:r>
+              <w:rPr>
+                <w:lang w:val="en-US"/>
+              </w:rPr>
+              <w:t>5</w:t>
+            </w:r>
+            <w:r>
+              <w:rPr>
+                <w:lang w:val="en-US"/>
+              </w:rPr>
+              <w:t>a1</w:t>
             </w:r>
           </w:p>
         </w:tc>
@@ -1835,7 +1776,7 @@
             <w:pPr>
               <w:spacing w:after="0"/>
               <w:rPr>
-                <w:lang w:val="it-IT"/>
+                <w:lang w:val="en-US"/>
               </w:rPr>
             </w:pPr>
           </w:p>
@@ -1860,9 +1801,15 @@
             <w:pPr>
               <w:spacing w:after="0"/>
               <w:rPr>
-                <w:lang w:val="it-IT"/>
-              </w:rPr>
-            </w:pPr>
+                <w:lang w:val="en-US"/>
+              </w:rPr>
+            </w:pPr>
+            <w:r>
+              <w:rPr>
+                <w:lang w:val="en-US"/>
+              </w:rPr>
+              <w:t>Detects that file extension is not JPG or PNG</w:t>
+            </w:r>
           </w:p>
         </w:tc>
       </w:tr>
@@ -1876,7 +1823,6 @@
             <w:vMerge/>
             <w:tcBorders>
               <w:left w:val="single" w:sz="8" w:space="0" w:color="00647A"/>
-              <w:bottom w:val="single" w:sz="8" w:space="0" w:color="00647A"/>
               <w:right w:val="single" w:sz="8" w:space="0" w:color="00647A"/>
             </w:tcBorders>
             <w:vAlign w:val="center"/>
@@ -1885,7 +1831,7 @@
             <w:pPr>
               <w:spacing w:after="0"/>
               <w:rPr>
-                <w:lang w:val="it-IT"/>
+                <w:lang w:val="en-US"/>
               </w:rPr>
             </w:pPr>
           </w:p>
@@ -1910,14 +1856,20 @@
             <w:pPr>
               <w:spacing w:after="0"/>
               <w:rPr>
-                <w:lang w:val="it-IT"/>
-              </w:rPr>
-            </w:pPr>
-            <w:r>
-              <w:rPr>
-                <w:lang w:val="it-IT"/>
-              </w:rPr>
-              <w:t>12</w:t>
+                <w:lang w:val="en-US"/>
+              </w:rPr>
+            </w:pPr>
+            <w:r>
+              <w:rPr>
+                <w:lang w:val="en-US"/>
+              </w:rPr>
+              <w:t>5</w:t>
+            </w:r>
+            <w:r>
+              <w:rPr>
+                <w:lang w:val="en-US"/>
+              </w:rPr>
+              <w:t>a2</w:t>
             </w:r>
           </w:p>
         </w:tc>
@@ -1941,7 +1893,7 @@
             <w:pPr>
               <w:spacing w:after="0"/>
               <w:rPr>
-                <w:lang w:val="it-IT"/>
+                <w:lang w:val="en-US"/>
               </w:rPr>
             </w:pPr>
           </w:p>
@@ -1966,9 +1918,15 @@
             <w:pPr>
               <w:spacing w:after="0"/>
               <w:rPr>
-                <w:lang w:val="it-IT"/>
-              </w:rPr>
-            </w:pPr>
+                <w:lang w:val="en-US"/>
+              </w:rPr>
+            </w:pPr>
+            <w:r>
+              <w:rPr>
+                <w:lang w:val="en-US"/>
+              </w:rPr>
+              <w:t>Shows error message: “Only JPG and PNG formats are supported.”</w:t>
+            </w:r>
           </w:p>
         </w:tc>
       </w:tr>
@@ -1979,10 +1937,10 @@
         <w:tc>
           <w:tcPr>
             <w:tcW w:w="1183" w:type="pct"/>
-            <w:vMerge w:val="restart"/>
-            <w:tcBorders>
-              <w:top w:val="single" w:sz="8" w:space="0" w:color="00647A"/>
-              <w:left w:val="single" w:sz="8" w:space="0" w:color="00647A"/>
+            <w:vMerge/>
+            <w:tcBorders>
+              <w:left w:val="single" w:sz="8" w:space="0" w:color="00647A"/>
+              <w:bottom w:val="single" w:sz="8" w:space="0" w:color="00647A"/>
               <w:right w:val="single" w:sz="8" w:space="0" w:color="00647A"/>
             </w:tcBorders>
             <w:vAlign w:val="center"/>
@@ -1991,23 +1949,9 @@
             <w:pPr>
               <w:spacing w:after="0"/>
               <w:rPr>
-                <w:lang w:val="it-IT"/>
-              </w:rPr>
-            </w:pPr>
-            <w:r>
-              <w:rPr>
-                <w:lang w:val="it-IT"/>
-              </w:rPr>
-              <w:t xml:space="preserve">Extension A: </w:t>
-            </w:r>
-            <w:proofErr w:type="spellStart"/>
-            <w:r>
-              <w:rPr>
-                <w:lang w:val="it-IT"/>
-              </w:rPr>
-              <w:t>Description</w:t>
-            </w:r>
-            <w:proofErr w:type="spellEnd"/>
+                <w:lang w:val="en-US"/>
+              </w:rPr>
+            </w:pPr>
           </w:p>
         </w:tc>
         <w:tc>
@@ -2030,14 +1974,20 @@
             <w:pPr>
               <w:spacing w:after="0"/>
               <w:rPr>
-                <w:lang w:val="it-IT"/>
-              </w:rPr>
-            </w:pPr>
-            <w:r>
-              <w:rPr>
-                <w:lang w:val="it-IT"/>
-              </w:rPr>
-              <w:t>7a</w:t>
+                <w:lang w:val="en-US"/>
+              </w:rPr>
+            </w:pPr>
+            <w:r>
+              <w:rPr>
+                <w:lang w:val="en-US"/>
+              </w:rPr>
+              <w:t>5</w:t>
+            </w:r>
+            <w:r>
+              <w:rPr>
+                <w:lang w:val="en-US"/>
+              </w:rPr>
+              <w:t>a3</w:t>
             </w:r>
           </w:p>
         </w:tc>
@@ -2061,9 +2011,15 @@
             <w:pPr>
               <w:spacing w:after="0"/>
               <w:rPr>
-                <w:lang w:val="it-IT"/>
-              </w:rPr>
-            </w:pPr>
+                <w:lang w:val="en-US"/>
+              </w:rPr>
+            </w:pPr>
+            <w:r>
+              <w:rPr>
+                <w:lang w:val="en-US"/>
+              </w:rPr>
+              <w:t>Corrects the file format replacing the file or deletes  it (rejoins at step 4)</w:t>
+            </w:r>
           </w:p>
         </w:tc>
         <w:tc>
@@ -2086,7 +2042,7 @@
             <w:pPr>
               <w:spacing w:after="0"/>
               <w:rPr>
-                <w:lang w:val="it-IT"/>
+                <w:lang w:val="en-US"/>
               </w:rPr>
             </w:pPr>
           </w:p>
@@ -2099,10 +2055,10 @@
         <w:tc>
           <w:tcPr>
             <w:tcW w:w="1183" w:type="pct"/>
-            <w:vMerge/>
-            <w:tcBorders>
-              <w:left w:val="single" w:sz="8" w:space="0" w:color="00647A"/>
-              <w:bottom w:val="single" w:sz="8" w:space="0" w:color="00647A"/>
+            <w:vMerge w:val="restart"/>
+            <w:tcBorders>
+              <w:top w:val="single" w:sz="8" w:space="0" w:color="00647A"/>
+              <w:left w:val="single" w:sz="8" w:space="0" w:color="00647A"/>
               <w:right w:val="single" w:sz="8" w:space="0" w:color="00647A"/>
             </w:tcBorders>
             <w:vAlign w:val="center"/>
@@ -2111,9 +2067,21 @@
             <w:pPr>
               <w:spacing w:after="0"/>
               <w:rPr>
-                <w:lang w:val="it-IT"/>
-              </w:rPr>
-            </w:pPr>
+                <w:lang w:val="en-US"/>
+              </w:rPr>
+            </w:pPr>
+            <w:r>
+              <w:rPr>
+                <w:lang w:val="en-US"/>
+              </w:rPr>
+              <w:t>Extension 5</w:t>
+            </w:r>
+            <w:r>
+              <w:rPr>
+                <w:lang w:val="en-US"/>
+              </w:rPr>
+              <w:t>b: Description</w:t>
+            </w:r>
           </w:p>
         </w:tc>
         <w:tc>
@@ -2136,14 +2104,26 @@
             <w:pPr>
               <w:spacing w:after="0"/>
               <w:rPr>
-                <w:lang w:val="it-IT"/>
-              </w:rPr>
-            </w:pPr>
-            <w:r>
-              <w:rPr>
-                <w:lang w:val="it-IT"/>
-              </w:rPr>
-              <w:t>8a</w:t>
+                <w:lang w:val="en-US"/>
+              </w:rPr>
+            </w:pPr>
+            <w:r>
+              <w:rPr>
+                <w:lang w:val="en-US"/>
+              </w:rPr>
+              <w:t>5</w:t>
+            </w:r>
+            <w:r>
+              <w:rPr>
+                <w:lang w:val="en-US"/>
+              </w:rPr>
+              <w:t>b</w:t>
+            </w:r>
+            <w:r>
+              <w:rPr>
+                <w:lang w:val="en-US"/>
+              </w:rPr>
+              <w:t>1</w:t>
             </w:r>
           </w:p>
         </w:tc>
@@ -2167,7 +2147,7 @@
             <w:pPr>
               <w:spacing w:after="0"/>
               <w:rPr>
-                <w:lang w:val="it-IT"/>
+                <w:lang w:val="en-US"/>
               </w:rPr>
             </w:pPr>
           </w:p>
@@ -2192,9 +2172,15 @@
             <w:pPr>
               <w:spacing w:after="0"/>
               <w:rPr>
-                <w:lang w:val="it-IT"/>
-              </w:rPr>
-            </w:pPr>
+                <w:lang w:val="en-US"/>
+              </w:rPr>
+            </w:pPr>
+            <w:r>
+              <w:rPr>
+                <w:lang w:val="en-US"/>
+              </w:rPr>
+              <w:t>Detects file size is &gt;5MB</w:t>
+            </w:r>
           </w:p>
         </w:tc>
       </w:tr>
@@ -2205,10 +2191,9 @@
         <w:tc>
           <w:tcPr>
             <w:tcW w:w="1183" w:type="pct"/>
-            <w:tcBorders>
-              <w:top w:val="single" w:sz="8" w:space="0" w:color="00647A"/>
-              <w:left w:val="single" w:sz="8" w:space="0" w:color="00647A"/>
-              <w:bottom w:val="single" w:sz="8" w:space="0" w:color="00647A"/>
+            <w:vMerge/>
+            <w:tcBorders>
+              <w:left w:val="single" w:sz="8" w:space="0" w:color="00647A"/>
               <w:right w:val="single" w:sz="8" w:space="0" w:color="00647A"/>
             </w:tcBorders>
             <w:vAlign w:val="center"/>
@@ -2217,7 +2202,7 @@
             <w:pPr>
               <w:spacing w:after="0"/>
               <w:rPr>
-                <w:lang w:val="it-IT"/>
+                <w:lang w:val="en-US"/>
               </w:rPr>
             </w:pPr>
           </w:p>
@@ -2242,9 +2227,21 @@
             <w:pPr>
               <w:spacing w:after="0"/>
               <w:rPr>
-                <w:lang w:val="it-IT"/>
-              </w:rPr>
-            </w:pPr>
+                <w:lang w:val="en-US"/>
+              </w:rPr>
+            </w:pPr>
+            <w:r>
+              <w:rPr>
+                <w:lang w:val="en-US"/>
+              </w:rPr>
+              <w:t>5</w:t>
+            </w:r>
+            <w:r>
+              <w:rPr>
+                <w:lang w:val="en-US"/>
+              </w:rPr>
+              <w:t>b2</w:t>
+            </w:r>
           </w:p>
         </w:tc>
         <w:tc>
@@ -2267,7 +2264,7 @@
             <w:pPr>
               <w:spacing w:after="0"/>
               <w:rPr>
-                <w:lang w:val="it-IT"/>
+                <w:lang w:val="en-US"/>
               </w:rPr>
             </w:pPr>
           </w:p>
@@ -2292,9 +2289,15 @@
             <w:pPr>
               <w:spacing w:after="0"/>
               <w:rPr>
-                <w:lang w:val="it-IT"/>
-              </w:rPr>
-            </w:pPr>
+                <w:lang w:val="en-US"/>
+              </w:rPr>
+            </w:pPr>
+            <w:r>
+              <w:rPr>
+                <w:lang w:val="en-US"/>
+              </w:rPr>
+              <w:t>Shows error message: “File is too large (Max 5MB).”</w:t>
+            </w:r>
           </w:p>
         </w:tc>
       </w:tr>
@@ -2305,8 +2308,8 @@
         <w:tc>
           <w:tcPr>
             <w:tcW w:w="1183" w:type="pct"/>
-            <w:tcBorders>
-              <w:top w:val="single" w:sz="8" w:space="0" w:color="00647A"/>
+            <w:vMerge/>
+            <w:tcBorders>
               <w:left w:val="single" w:sz="8" w:space="0" w:color="00647A"/>
               <w:bottom w:val="single" w:sz="8" w:space="0" w:color="00647A"/>
               <w:right w:val="single" w:sz="8" w:space="0" w:color="00647A"/>
@@ -2317,7 +2320,7 @@
             <w:pPr>
               <w:spacing w:after="0"/>
               <w:rPr>
-                <w:lang w:val="it-IT"/>
+                <w:lang w:val="en-US"/>
               </w:rPr>
             </w:pPr>
           </w:p>
@@ -2342,9 +2345,21 @@
             <w:pPr>
               <w:spacing w:after="0"/>
               <w:rPr>
-                <w:lang w:val="it-IT"/>
-              </w:rPr>
-            </w:pPr>
+                <w:lang w:val="en-US"/>
+              </w:rPr>
+            </w:pPr>
+            <w:r>
+              <w:rPr>
+                <w:lang w:val="en-US"/>
+              </w:rPr>
+              <w:t>5</w:t>
+            </w:r>
+            <w:r>
+              <w:rPr>
+                <w:lang w:val="en-US"/>
+              </w:rPr>
+              <w:t>b3</w:t>
+            </w:r>
           </w:p>
         </w:tc>
         <w:tc>
@@ -2367,9 +2382,15 @@
             <w:pPr>
               <w:spacing w:after="0"/>
               <w:rPr>
-                <w:lang w:val="it-IT"/>
-              </w:rPr>
-            </w:pPr>
+                <w:lang w:val="en-US"/>
+              </w:rPr>
+            </w:pPr>
+            <w:r>
+              <w:rPr>
+                <w:lang w:val="en-US"/>
+              </w:rPr>
+              <w:t>Selects a smaller file or deletes it and re-submits (rejoin at step 4)</w:t>
+            </w:r>
           </w:p>
         </w:tc>
         <w:tc>
@@ -2392,9 +2413,739 @@
             <w:pPr>
               <w:spacing w:after="0"/>
               <w:rPr>
-                <w:lang w:val="it-IT"/>
-              </w:rPr>
-            </w:pPr>
+                <w:lang w:val="en-US"/>
+              </w:rPr>
+            </w:pPr>
+          </w:p>
+        </w:tc>
+      </w:tr>
+      <w:tr>
+        <w:trPr>
+          <w:trHeight w:val="20"/>
+        </w:trPr>
+        <w:tc>
+          <w:tcPr>
+            <w:tcW w:w="1183" w:type="pct"/>
+            <w:vMerge w:val="restart"/>
+            <w:tcBorders>
+              <w:top w:val="single" w:sz="8" w:space="0" w:color="00647A"/>
+              <w:left w:val="single" w:sz="8" w:space="0" w:color="00647A"/>
+              <w:right w:val="single" w:sz="8" w:space="0" w:color="00647A"/>
+            </w:tcBorders>
+            <w:vAlign w:val="center"/>
+          </w:tcPr>
+          <w:p>
+            <w:pPr>
+              <w:spacing w:after="0"/>
+              <w:rPr>
+                <w:lang w:val="en-US"/>
+              </w:rPr>
+            </w:pPr>
+            <w:r>
+              <w:rPr>
+                <w:lang w:val="en-US"/>
+              </w:rPr>
+              <w:t>Extension 7</w:t>
+            </w:r>
+            <w:r>
+              <w:rPr>
+                <w:lang w:val="en-US"/>
+              </w:rPr>
+              <w:t>a: Description</w:t>
+            </w:r>
+          </w:p>
+        </w:tc>
+        <w:tc>
+          <w:tcPr>
+            <w:tcW w:w="451" w:type="pct"/>
+            <w:tcBorders>
+              <w:top w:val="single" w:sz="8" w:space="0" w:color="00647A"/>
+              <w:left w:val="single" w:sz="8" w:space="0" w:color="00647A"/>
+              <w:bottom w:val="single" w:sz="8" w:space="0" w:color="00647A"/>
+              <w:right w:val="single" w:sz="8" w:space="0" w:color="00647A"/>
+            </w:tcBorders>
+            <w:tcMar>
+              <w:top w:w="72" w:type="dxa"/>
+              <w:left w:w="144" w:type="dxa"/>
+              <w:bottom w:w="72" w:type="dxa"/>
+              <w:right w:w="144" w:type="dxa"/>
+            </w:tcMar>
+          </w:tcPr>
+          <w:p>
+            <w:pPr>
+              <w:spacing w:after="0"/>
+              <w:rPr>
+                <w:lang w:val="en-US"/>
+              </w:rPr>
+            </w:pPr>
+            <w:r>
+              <w:rPr>
+                <w:lang w:val="en-US"/>
+              </w:rPr>
+              <w:t>7</w:t>
+            </w:r>
+            <w:r>
+              <w:rPr>
+                <w:lang w:val="en-US"/>
+              </w:rPr>
+              <w:t>a1</w:t>
+            </w:r>
+          </w:p>
+        </w:tc>
+        <w:tc>
+          <w:tcPr>
+            <w:tcW w:w="1724" w:type="pct"/>
+            <w:tcBorders>
+              <w:top w:val="single" w:sz="8" w:space="0" w:color="00647A"/>
+              <w:left w:val="single" w:sz="8" w:space="0" w:color="00647A"/>
+              <w:bottom w:val="single" w:sz="8" w:space="0" w:color="00647A"/>
+              <w:right w:val="single" w:sz="8" w:space="0" w:color="00647A"/>
+            </w:tcBorders>
+            <w:tcMar>
+              <w:top w:w="72" w:type="dxa"/>
+              <w:left w:w="144" w:type="dxa"/>
+              <w:bottom w:w="72" w:type="dxa"/>
+              <w:right w:w="144" w:type="dxa"/>
+            </w:tcMar>
+          </w:tcPr>
+          <w:p>
+            <w:pPr>
+              <w:spacing w:after="0"/>
+              <w:rPr>
+                <w:lang w:val="en-US"/>
+              </w:rPr>
+            </w:pPr>
+          </w:p>
+        </w:tc>
+        <w:tc>
+          <w:tcPr>
+            <w:tcW w:w="1642" w:type="pct"/>
+            <w:tcBorders>
+              <w:top w:val="single" w:sz="8" w:space="0" w:color="00647A"/>
+              <w:left w:val="single" w:sz="8" w:space="0" w:color="00647A"/>
+              <w:bottom w:val="single" w:sz="8" w:space="0" w:color="00647A"/>
+              <w:right w:val="single" w:sz="8" w:space="0" w:color="00647A"/>
+            </w:tcBorders>
+            <w:tcMar>
+              <w:top w:w="72" w:type="dxa"/>
+              <w:left w:w="144" w:type="dxa"/>
+              <w:bottom w:w="72" w:type="dxa"/>
+              <w:right w:w="144" w:type="dxa"/>
+            </w:tcMar>
+          </w:tcPr>
+          <w:p>
+            <w:pPr>
+              <w:spacing w:after="0"/>
+              <w:rPr>
+                <w:lang w:val="en-US"/>
+              </w:rPr>
+            </w:pPr>
+            <w:r>
+              <w:rPr>
+                <w:lang w:val="en-US"/>
+              </w:rPr>
+              <w:t>Detects title length &lt;10 chars</w:t>
+            </w:r>
+          </w:p>
+        </w:tc>
+      </w:tr>
+      <w:tr>
+        <w:trPr>
+          <w:trHeight w:val="20"/>
+        </w:trPr>
+        <w:tc>
+          <w:tcPr>
+            <w:tcW w:w="1183" w:type="pct"/>
+            <w:vMerge/>
+            <w:tcBorders>
+              <w:left w:val="single" w:sz="8" w:space="0" w:color="00647A"/>
+              <w:right w:val="single" w:sz="8" w:space="0" w:color="00647A"/>
+            </w:tcBorders>
+            <w:vAlign w:val="center"/>
+          </w:tcPr>
+          <w:p>
+            <w:pPr>
+              <w:spacing w:after="0"/>
+              <w:rPr>
+                <w:lang w:val="en-US"/>
+              </w:rPr>
+            </w:pPr>
+          </w:p>
+        </w:tc>
+        <w:tc>
+          <w:tcPr>
+            <w:tcW w:w="451" w:type="pct"/>
+            <w:tcBorders>
+              <w:top w:val="single" w:sz="8" w:space="0" w:color="00647A"/>
+              <w:left w:val="single" w:sz="8" w:space="0" w:color="00647A"/>
+              <w:bottom w:val="single" w:sz="8" w:space="0" w:color="00647A"/>
+              <w:right w:val="single" w:sz="8" w:space="0" w:color="00647A"/>
+            </w:tcBorders>
+            <w:tcMar>
+              <w:top w:w="72" w:type="dxa"/>
+              <w:left w:w="144" w:type="dxa"/>
+              <w:bottom w:w="72" w:type="dxa"/>
+              <w:right w:w="144" w:type="dxa"/>
+            </w:tcMar>
+          </w:tcPr>
+          <w:p>
+            <w:pPr>
+              <w:spacing w:after="0"/>
+              <w:rPr>
+                <w:lang w:val="en-US"/>
+              </w:rPr>
+            </w:pPr>
+            <w:r>
+              <w:rPr>
+                <w:lang w:val="en-US"/>
+              </w:rPr>
+              <w:t>7</w:t>
+            </w:r>
+            <w:r>
+              <w:rPr>
+                <w:lang w:val="en-US"/>
+              </w:rPr>
+              <w:t>a2</w:t>
+            </w:r>
+          </w:p>
+        </w:tc>
+        <w:tc>
+          <w:tcPr>
+            <w:tcW w:w="1724" w:type="pct"/>
+            <w:tcBorders>
+              <w:top w:val="single" w:sz="8" w:space="0" w:color="00647A"/>
+              <w:left w:val="single" w:sz="8" w:space="0" w:color="00647A"/>
+              <w:bottom w:val="single" w:sz="8" w:space="0" w:color="00647A"/>
+              <w:right w:val="single" w:sz="8" w:space="0" w:color="00647A"/>
+            </w:tcBorders>
+            <w:tcMar>
+              <w:top w:w="72" w:type="dxa"/>
+              <w:left w:w="144" w:type="dxa"/>
+              <w:bottom w:w="72" w:type="dxa"/>
+              <w:right w:w="144" w:type="dxa"/>
+            </w:tcMar>
+          </w:tcPr>
+          <w:p>
+            <w:pPr>
+              <w:spacing w:after="0"/>
+              <w:rPr>
+                <w:lang w:val="en-US"/>
+              </w:rPr>
+            </w:pPr>
+          </w:p>
+        </w:tc>
+        <w:tc>
+          <w:tcPr>
+            <w:tcW w:w="1642" w:type="pct"/>
+            <w:tcBorders>
+              <w:top w:val="single" w:sz="8" w:space="0" w:color="00647A"/>
+              <w:left w:val="single" w:sz="8" w:space="0" w:color="00647A"/>
+              <w:bottom w:val="single" w:sz="8" w:space="0" w:color="00647A"/>
+              <w:right w:val="single" w:sz="8" w:space="0" w:color="00647A"/>
+            </w:tcBorders>
+            <w:tcMar>
+              <w:top w:w="72" w:type="dxa"/>
+              <w:left w:w="144" w:type="dxa"/>
+              <w:bottom w:w="72" w:type="dxa"/>
+              <w:right w:w="144" w:type="dxa"/>
+            </w:tcMar>
+          </w:tcPr>
+          <w:p>
+            <w:pPr>
+              <w:spacing w:after="0"/>
+              <w:rPr>
+                <w:lang w:val="en-US"/>
+              </w:rPr>
+            </w:pPr>
+            <w:r>
+              <w:rPr>
+                <w:lang w:val="en-US"/>
+              </w:rPr>
+              <w:t>Shows error message: “Title must be at least 10 characters.”</w:t>
+            </w:r>
+          </w:p>
+        </w:tc>
+      </w:tr>
+      <w:tr>
+        <w:trPr>
+          <w:trHeight w:val="20"/>
+        </w:trPr>
+        <w:tc>
+          <w:tcPr>
+            <w:tcW w:w="1183" w:type="pct"/>
+            <w:vMerge/>
+            <w:tcBorders>
+              <w:left w:val="single" w:sz="8" w:space="0" w:color="00647A"/>
+              <w:bottom w:val="single" w:sz="8" w:space="0" w:color="00647A"/>
+              <w:right w:val="single" w:sz="8" w:space="0" w:color="00647A"/>
+            </w:tcBorders>
+            <w:vAlign w:val="center"/>
+          </w:tcPr>
+          <w:p>
+            <w:pPr>
+              <w:spacing w:after="0"/>
+              <w:rPr>
+                <w:lang w:val="en-US"/>
+              </w:rPr>
+            </w:pPr>
+          </w:p>
+        </w:tc>
+        <w:tc>
+          <w:tcPr>
+            <w:tcW w:w="451" w:type="pct"/>
+            <w:tcBorders>
+              <w:top w:val="single" w:sz="8" w:space="0" w:color="00647A"/>
+              <w:left w:val="single" w:sz="8" w:space="0" w:color="00647A"/>
+              <w:bottom w:val="single" w:sz="8" w:space="0" w:color="00647A"/>
+              <w:right w:val="single" w:sz="8" w:space="0" w:color="00647A"/>
+            </w:tcBorders>
+            <w:tcMar>
+              <w:top w:w="72" w:type="dxa"/>
+              <w:left w:w="144" w:type="dxa"/>
+              <w:bottom w:w="72" w:type="dxa"/>
+              <w:right w:w="144" w:type="dxa"/>
+            </w:tcMar>
+          </w:tcPr>
+          <w:p>
+            <w:pPr>
+              <w:spacing w:after="0"/>
+              <w:rPr>
+                <w:lang w:val="en-US"/>
+              </w:rPr>
+            </w:pPr>
+            <w:r>
+              <w:rPr>
+                <w:lang w:val="en-US"/>
+              </w:rPr>
+              <w:t>7</w:t>
+            </w:r>
+            <w:r>
+              <w:rPr>
+                <w:lang w:val="en-US"/>
+              </w:rPr>
+              <w:t>a3</w:t>
+            </w:r>
+          </w:p>
+        </w:tc>
+        <w:tc>
+          <w:tcPr>
+            <w:tcW w:w="1724" w:type="pct"/>
+            <w:tcBorders>
+              <w:top w:val="single" w:sz="8" w:space="0" w:color="00647A"/>
+              <w:left w:val="single" w:sz="8" w:space="0" w:color="00647A"/>
+              <w:bottom w:val="single" w:sz="8" w:space="0" w:color="00647A"/>
+              <w:right w:val="single" w:sz="8" w:space="0" w:color="00647A"/>
+            </w:tcBorders>
+            <w:tcMar>
+              <w:top w:w="72" w:type="dxa"/>
+              <w:left w:w="144" w:type="dxa"/>
+              <w:bottom w:w="72" w:type="dxa"/>
+              <w:right w:w="144" w:type="dxa"/>
+            </w:tcMar>
+          </w:tcPr>
+          <w:p>
+            <w:pPr>
+              <w:spacing w:after="0"/>
+              <w:rPr>
+                <w:lang w:val="en-US"/>
+              </w:rPr>
+            </w:pPr>
+            <w:r>
+              <w:rPr>
+                <w:lang w:val="en-US"/>
+              </w:rPr>
+              <w:t>Corrects the Title and re-submits (rejoins at step 4)</w:t>
+            </w:r>
+          </w:p>
+        </w:tc>
+        <w:tc>
+          <w:tcPr>
+            <w:tcW w:w="1642" w:type="pct"/>
+            <w:tcBorders>
+              <w:top w:val="single" w:sz="8" w:space="0" w:color="00647A"/>
+              <w:left w:val="single" w:sz="8" w:space="0" w:color="00647A"/>
+              <w:bottom w:val="single" w:sz="8" w:space="0" w:color="00647A"/>
+              <w:right w:val="single" w:sz="8" w:space="0" w:color="00647A"/>
+            </w:tcBorders>
+            <w:tcMar>
+              <w:top w:w="72" w:type="dxa"/>
+              <w:left w:w="144" w:type="dxa"/>
+              <w:bottom w:w="72" w:type="dxa"/>
+              <w:right w:w="144" w:type="dxa"/>
+            </w:tcMar>
+          </w:tcPr>
+          <w:p>
+            <w:pPr>
+              <w:spacing w:after="0"/>
+              <w:rPr>
+                <w:lang w:val="en-US"/>
+              </w:rPr>
+            </w:pPr>
+          </w:p>
+        </w:tc>
+      </w:tr>
+      <w:tr>
+        <w:trPr>
+          <w:trHeight w:val="20"/>
+        </w:trPr>
+        <w:tc>
+          <w:tcPr>
+            <w:tcW w:w="1183" w:type="pct"/>
+            <w:vMerge w:val="restart"/>
+            <w:tcBorders>
+              <w:top w:val="single" w:sz="8" w:space="0" w:color="00647A"/>
+              <w:left w:val="single" w:sz="8" w:space="0" w:color="00647A"/>
+              <w:right w:val="single" w:sz="8" w:space="0" w:color="00647A"/>
+            </w:tcBorders>
+            <w:vAlign w:val="center"/>
+          </w:tcPr>
+          <w:p>
+            <w:pPr>
+              <w:spacing w:after="0"/>
+              <w:rPr>
+                <w:lang w:val="en-US"/>
+              </w:rPr>
+            </w:pPr>
+            <w:r>
+              <w:rPr>
+                <w:lang w:val="en-US"/>
+              </w:rPr>
+              <w:t>Extension 8</w:t>
+            </w:r>
+            <w:r>
+              <w:rPr>
+                <w:lang w:val="en-US"/>
+              </w:rPr>
+              <w:t>a: Description</w:t>
+            </w:r>
+          </w:p>
+        </w:tc>
+        <w:tc>
+          <w:tcPr>
+            <w:tcW w:w="451" w:type="pct"/>
+            <w:tcBorders>
+              <w:top w:val="single" w:sz="8" w:space="0" w:color="00647A"/>
+              <w:left w:val="single" w:sz="8" w:space="0" w:color="00647A"/>
+              <w:bottom w:val="single" w:sz="8" w:space="0" w:color="00647A"/>
+              <w:right w:val="single" w:sz="8" w:space="0" w:color="00647A"/>
+            </w:tcBorders>
+            <w:tcMar>
+              <w:top w:w="72" w:type="dxa"/>
+              <w:left w:w="144" w:type="dxa"/>
+              <w:bottom w:w="72" w:type="dxa"/>
+              <w:right w:w="144" w:type="dxa"/>
+            </w:tcMar>
+          </w:tcPr>
+          <w:p>
+            <w:pPr>
+              <w:spacing w:after="0"/>
+              <w:rPr>
+                <w:lang w:val="en-US"/>
+              </w:rPr>
+            </w:pPr>
+            <w:r>
+              <w:rPr>
+                <w:lang w:val="en-US"/>
+              </w:rPr>
+              <w:t>8</w:t>
+            </w:r>
+            <w:r>
+              <w:rPr>
+                <w:lang w:val="en-US"/>
+              </w:rPr>
+              <w:t>a1</w:t>
+            </w:r>
+          </w:p>
+        </w:tc>
+        <w:tc>
+          <w:tcPr>
+            <w:tcW w:w="1724" w:type="pct"/>
+            <w:tcBorders>
+              <w:top w:val="single" w:sz="8" w:space="0" w:color="00647A"/>
+              <w:left w:val="single" w:sz="8" w:space="0" w:color="00647A"/>
+              <w:bottom w:val="single" w:sz="8" w:space="0" w:color="00647A"/>
+              <w:right w:val="single" w:sz="8" w:space="0" w:color="00647A"/>
+            </w:tcBorders>
+            <w:tcMar>
+              <w:top w:w="72" w:type="dxa"/>
+              <w:left w:w="144" w:type="dxa"/>
+              <w:bottom w:w="72" w:type="dxa"/>
+              <w:right w:w="144" w:type="dxa"/>
+            </w:tcMar>
+          </w:tcPr>
+          <w:p>
+            <w:pPr>
+              <w:spacing w:after="0"/>
+              <w:rPr>
+                <w:lang w:val="en-US"/>
+              </w:rPr>
+            </w:pPr>
+          </w:p>
+        </w:tc>
+        <w:tc>
+          <w:tcPr>
+            <w:tcW w:w="1642" w:type="pct"/>
+            <w:tcBorders>
+              <w:top w:val="single" w:sz="8" w:space="0" w:color="00647A"/>
+              <w:left w:val="single" w:sz="8" w:space="0" w:color="00647A"/>
+              <w:bottom w:val="single" w:sz="8" w:space="0" w:color="00647A"/>
+              <w:right w:val="single" w:sz="8" w:space="0" w:color="00647A"/>
+            </w:tcBorders>
+            <w:tcMar>
+              <w:top w:w="72" w:type="dxa"/>
+              <w:left w:w="144" w:type="dxa"/>
+              <w:bottom w:w="72" w:type="dxa"/>
+              <w:right w:w="144" w:type="dxa"/>
+            </w:tcMar>
+          </w:tcPr>
+          <w:p>
+            <w:pPr>
+              <w:spacing w:after="0"/>
+              <w:rPr>
+                <w:lang w:val="en-US"/>
+              </w:rPr>
+            </w:pPr>
+            <w:r>
+              <w:rPr>
+                <w:lang w:val="en-US"/>
+              </w:rPr>
+              <w:t>Fails to save data due to connection error</w:t>
+            </w:r>
+          </w:p>
+        </w:tc>
+      </w:tr>
+      <w:tr>
+        <w:trPr>
+          <w:trHeight w:val="20"/>
+        </w:trPr>
+        <w:tc>
+          <w:tcPr>
+            <w:tcW w:w="1183" w:type="pct"/>
+            <w:vMerge/>
+            <w:tcBorders>
+              <w:left w:val="single" w:sz="8" w:space="0" w:color="00647A"/>
+              <w:right w:val="single" w:sz="8" w:space="0" w:color="00647A"/>
+            </w:tcBorders>
+            <w:vAlign w:val="center"/>
+          </w:tcPr>
+          <w:p>
+            <w:pPr>
+              <w:spacing w:after="0"/>
+              <w:rPr>
+                <w:lang w:val="en-US"/>
+              </w:rPr>
+            </w:pPr>
+          </w:p>
+        </w:tc>
+        <w:tc>
+          <w:tcPr>
+            <w:tcW w:w="451" w:type="pct"/>
+            <w:tcBorders>
+              <w:top w:val="single" w:sz="8" w:space="0" w:color="00647A"/>
+              <w:left w:val="single" w:sz="8" w:space="0" w:color="00647A"/>
+              <w:bottom w:val="single" w:sz="8" w:space="0" w:color="00647A"/>
+              <w:right w:val="single" w:sz="8" w:space="0" w:color="00647A"/>
+            </w:tcBorders>
+            <w:tcMar>
+              <w:top w:w="72" w:type="dxa"/>
+              <w:left w:w="144" w:type="dxa"/>
+              <w:bottom w:w="72" w:type="dxa"/>
+              <w:right w:w="144" w:type="dxa"/>
+            </w:tcMar>
+          </w:tcPr>
+          <w:p>
+            <w:pPr>
+              <w:spacing w:after="0"/>
+              <w:rPr>
+                <w:lang w:val="en-US"/>
+              </w:rPr>
+            </w:pPr>
+            <w:r>
+              <w:rPr>
+                <w:lang w:val="en-US"/>
+              </w:rPr>
+              <w:t>8</w:t>
+            </w:r>
+            <w:r>
+              <w:rPr>
+                <w:lang w:val="en-US"/>
+              </w:rPr>
+              <w:t>a2</w:t>
+            </w:r>
+          </w:p>
+        </w:tc>
+        <w:tc>
+          <w:tcPr>
+            <w:tcW w:w="1724" w:type="pct"/>
+            <w:tcBorders>
+              <w:top w:val="single" w:sz="8" w:space="0" w:color="00647A"/>
+              <w:left w:val="single" w:sz="8" w:space="0" w:color="00647A"/>
+              <w:bottom w:val="single" w:sz="8" w:space="0" w:color="00647A"/>
+              <w:right w:val="single" w:sz="8" w:space="0" w:color="00647A"/>
+            </w:tcBorders>
+            <w:tcMar>
+              <w:top w:w="72" w:type="dxa"/>
+              <w:left w:w="144" w:type="dxa"/>
+              <w:bottom w:w="72" w:type="dxa"/>
+              <w:right w:w="144" w:type="dxa"/>
+            </w:tcMar>
+          </w:tcPr>
+          <w:p>
+            <w:pPr>
+              <w:spacing w:after="0"/>
+              <w:rPr>
+                <w:lang w:val="en-US"/>
+              </w:rPr>
+            </w:pPr>
+          </w:p>
+        </w:tc>
+        <w:tc>
+          <w:tcPr>
+            <w:tcW w:w="1642" w:type="pct"/>
+            <w:tcBorders>
+              <w:top w:val="single" w:sz="8" w:space="0" w:color="00647A"/>
+              <w:left w:val="single" w:sz="8" w:space="0" w:color="00647A"/>
+              <w:bottom w:val="single" w:sz="8" w:space="0" w:color="00647A"/>
+              <w:right w:val="single" w:sz="8" w:space="0" w:color="00647A"/>
+            </w:tcBorders>
+            <w:tcMar>
+              <w:top w:w="72" w:type="dxa"/>
+              <w:left w:w="144" w:type="dxa"/>
+              <w:bottom w:w="72" w:type="dxa"/>
+              <w:right w:w="144" w:type="dxa"/>
+            </w:tcMar>
+          </w:tcPr>
+          <w:p>
+            <w:pPr>
+              <w:spacing w:after="0"/>
+              <w:rPr>
+                <w:lang w:val="en-US"/>
+              </w:rPr>
+            </w:pPr>
+            <w:r>
+              <w:rPr>
+                <w:lang w:val="en-US"/>
+              </w:rPr>
+              <w:t>Shows generic error: “Service unavailable, please try again.”</w:t>
+            </w:r>
+          </w:p>
+        </w:tc>
+      </w:tr>
+      <w:tr>
+        <w:trPr>
+          <w:trHeight w:val="20"/>
+        </w:trPr>
+        <w:tc>
+          <w:tcPr>
+            <w:tcW w:w="1183" w:type="pct"/>
+            <w:vMerge/>
+            <w:tcBorders>
+              <w:left w:val="single" w:sz="8" w:space="0" w:color="00647A"/>
+              <w:bottom w:val="single" w:sz="8" w:space="0" w:color="00647A"/>
+              <w:right w:val="single" w:sz="8" w:space="0" w:color="00647A"/>
+            </w:tcBorders>
+            <w:vAlign w:val="center"/>
+          </w:tcPr>
+          <w:p>
+            <w:pPr>
+              <w:spacing w:after="0"/>
+              <w:rPr>
+                <w:lang w:val="en-US"/>
+              </w:rPr>
+            </w:pPr>
+          </w:p>
+        </w:tc>
+        <w:tc>
+          <w:tcPr>
+            <w:tcW w:w="451" w:type="pct"/>
+            <w:tcBorders>
+              <w:top w:val="single" w:sz="8" w:space="0" w:color="00647A"/>
+              <w:left w:val="single" w:sz="8" w:space="0" w:color="00647A"/>
+              <w:bottom w:val="single" w:sz="8" w:space="0" w:color="00647A"/>
+              <w:right w:val="single" w:sz="8" w:space="0" w:color="00647A"/>
+            </w:tcBorders>
+            <w:tcMar>
+              <w:top w:w="72" w:type="dxa"/>
+              <w:left w:w="144" w:type="dxa"/>
+              <w:bottom w:w="72" w:type="dxa"/>
+              <w:right w:w="144" w:type="dxa"/>
+            </w:tcMar>
+          </w:tcPr>
+          <w:p>
+            <w:pPr>
+              <w:spacing w:after="0"/>
+              <w:rPr>
+                <w:lang w:val="en-US"/>
+              </w:rPr>
+            </w:pPr>
+            <w:r>
+              <w:rPr>
+                <w:lang w:val="en-US"/>
+              </w:rPr>
+              <w:t>8</w:t>
+            </w:r>
+            <w:r>
+              <w:rPr>
+                <w:lang w:val="en-US"/>
+              </w:rPr>
+              <w:t>a3</w:t>
+            </w:r>
+          </w:p>
+        </w:tc>
+        <w:tc>
+          <w:tcPr>
+            <w:tcW w:w="1724" w:type="pct"/>
+            <w:tcBorders>
+              <w:top w:val="single" w:sz="8" w:space="0" w:color="00647A"/>
+              <w:left w:val="single" w:sz="8" w:space="0" w:color="00647A"/>
+              <w:bottom w:val="single" w:sz="8" w:space="0" w:color="00647A"/>
+              <w:right w:val="single" w:sz="8" w:space="0" w:color="00647A"/>
+            </w:tcBorders>
+            <w:tcMar>
+              <w:top w:w="72" w:type="dxa"/>
+              <w:left w:w="144" w:type="dxa"/>
+              <w:bottom w:w="72" w:type="dxa"/>
+              <w:right w:w="144" w:type="dxa"/>
+            </w:tcMar>
+          </w:tcPr>
+          <w:p>
+            <w:pPr>
+              <w:spacing w:after="0"/>
+              <w:rPr>
+                <w:lang w:val="en-US"/>
+              </w:rPr>
+            </w:pPr>
+          </w:p>
+        </w:tc>
+        <w:tc>
+          <w:tcPr>
+            <w:tcW w:w="1642" w:type="pct"/>
+            <w:tcBorders>
+              <w:top w:val="single" w:sz="8" w:space="0" w:color="00647A"/>
+              <w:left w:val="single" w:sz="8" w:space="0" w:color="00647A"/>
+              <w:bottom w:val="single" w:sz="8" w:space="0" w:color="00647A"/>
+              <w:right w:val="single" w:sz="8" w:space="0" w:color="00647A"/>
+            </w:tcBorders>
+            <w:tcMar>
+              <w:top w:w="72" w:type="dxa"/>
+              <w:left w:w="144" w:type="dxa"/>
+              <w:bottom w:w="72" w:type="dxa"/>
+              <w:right w:w="144" w:type="dxa"/>
+            </w:tcMar>
+          </w:tcPr>
+          <w:p>
+            <w:pPr>
+              <w:spacing w:after="0"/>
+              <w:rPr>
+                <w:lang w:val="en-US"/>
+              </w:rPr>
+            </w:pPr>
+            <w:r>
+              <w:rPr>
+                <w:lang w:val="en-US"/>
+              </w:rPr>
+              <w:t>Retains information in the “New Issue” but does not save the new issue to the database</w:t>
+            </w:r>
           </w:p>
         </w:tc>
       </w:tr>
@@ -2402,22 +3153,24 @@
     <w:p>
       <w:pPr>
         <w:rPr>
-          <w:lang w:val="it-IT"/>
+          <w:lang w:val="en-US"/>
         </w:rPr>
       </w:pPr>
     </w:p>
     <w:p>
       <w:pPr>
         <w:rPr>
-          <w:lang w:val="it-IT"/>
+          <w:lang w:val="en-US"/>
         </w:rPr>
       </w:pPr>
       <w:r>
         <w:rPr>
-          <w:lang w:val="it-IT"/>
+          <w:lang w:val="en-US"/>
         </w:rPr>
         <w:br w:type="page"/>
       </w:r>
+      <w:bookmarkStart w:id="0" w:name="_GoBack"/>
+      <w:bookmarkEnd w:id="0"/>
     </w:p>
     <w:tbl>
       <w:tblPr>
@@ -2429,9 +3182,9 @@
         <w:tblLook w:val="04A0" w:firstRow="1" w:lastRow="0" w:firstColumn="1" w:lastColumn="0" w:noHBand="0" w:noVBand="1"/>
       </w:tblPr>
       <w:tblGrid>
-        <w:gridCol w:w="2346"/>
-        <w:gridCol w:w="895"/>
-        <w:gridCol w:w="2225"/>
+        <w:gridCol w:w="2347"/>
+        <w:gridCol w:w="1058"/>
+        <w:gridCol w:w="2061"/>
         <w:gridCol w:w="2225"/>
         <w:gridCol w:w="2235"/>
       </w:tblGrid>
@@ -2441,7 +3194,7 @@
         </w:trPr>
         <w:tc>
           <w:tcPr>
-            <w:tcW w:w="1181" w:type="pct"/>
+            <w:tcW w:w="1182" w:type="pct"/>
             <w:tcBorders>
               <w:top w:val="single" w:sz="8" w:space="0" w:color="00647A"/>
               <w:left w:val="single" w:sz="8" w:space="0" w:color="00647A"/>
@@ -2473,7 +3226,7 @@
         </w:tc>
         <w:tc>
           <w:tcPr>
-            <w:tcW w:w="3819" w:type="pct"/>
+            <w:tcW w:w="3818" w:type="pct"/>
             <w:gridSpan w:val="4"/>
             <w:tcBorders>
               <w:top w:val="single" w:sz="8" w:space="0" w:color="00647A"/>
@@ -2523,7 +3276,7 @@
         </w:trPr>
         <w:tc>
           <w:tcPr>
-            <w:tcW w:w="1181" w:type="pct"/>
+            <w:tcW w:w="1182" w:type="pct"/>
             <w:tcBorders>
               <w:top w:val="single" w:sz="18" w:space="0" w:color="00647A"/>
               <w:left w:val="single" w:sz="8" w:space="0" w:color="00647A"/>
@@ -2565,7 +3318,7 @@
         </w:tc>
         <w:tc>
           <w:tcPr>
-            <w:tcW w:w="3819" w:type="pct"/>
+            <w:tcW w:w="3818" w:type="pct"/>
             <w:gridSpan w:val="4"/>
             <w:tcBorders>
               <w:top w:val="single" w:sz="18" w:space="0" w:color="00647A"/>
@@ -2597,7 +3350,7 @@
         </w:trPr>
         <w:tc>
           <w:tcPr>
-            <w:tcW w:w="1181" w:type="pct"/>
+            <w:tcW w:w="1182" w:type="pct"/>
             <w:tcBorders>
               <w:top w:val="single" w:sz="8" w:space="0" w:color="00647A"/>
               <w:left w:val="single" w:sz="8" w:space="0" w:color="00647A"/>
@@ -2630,7 +3383,7 @@
         </w:tc>
         <w:tc>
           <w:tcPr>
-            <w:tcW w:w="3819" w:type="pct"/>
+            <w:tcW w:w="3818" w:type="pct"/>
             <w:gridSpan w:val="4"/>
             <w:tcBorders>
               <w:top w:val="single" w:sz="8" w:space="0" w:color="00647A"/>
@@ -2661,7 +3414,7 @@
         </w:trPr>
         <w:tc>
           <w:tcPr>
-            <w:tcW w:w="1181" w:type="pct"/>
+            <w:tcW w:w="1182" w:type="pct"/>
             <w:tcBorders>
               <w:top w:val="single" w:sz="8" w:space="0" w:color="00647A"/>
               <w:left w:val="single" w:sz="8" w:space="0" w:color="00647A"/>
@@ -2703,7 +3456,7 @@
         </w:tc>
         <w:tc>
           <w:tcPr>
-            <w:tcW w:w="3819" w:type="pct"/>
+            <w:tcW w:w="3818" w:type="pct"/>
             <w:gridSpan w:val="4"/>
             <w:tcBorders>
               <w:top w:val="single" w:sz="8" w:space="0" w:color="00647A"/>
@@ -2735,7 +3488,7 @@
         </w:trPr>
         <w:tc>
           <w:tcPr>
-            <w:tcW w:w="1181" w:type="pct"/>
+            <w:tcW w:w="1182" w:type="pct"/>
             <w:tcBorders>
               <w:top w:val="single" w:sz="8" w:space="0" w:color="00647A"/>
               <w:left w:val="single" w:sz="8" w:space="0" w:color="00647A"/>
@@ -2786,7 +3539,7 @@
         </w:tc>
         <w:tc>
           <w:tcPr>
-            <w:tcW w:w="3819" w:type="pct"/>
+            <w:tcW w:w="3818" w:type="pct"/>
             <w:gridSpan w:val="4"/>
             <w:tcBorders>
               <w:top w:val="single" w:sz="8" w:space="0" w:color="00647A"/>
@@ -2817,7 +3570,7 @@
         </w:trPr>
         <w:tc>
           <w:tcPr>
-            <w:tcW w:w="1181" w:type="pct"/>
+            <w:tcW w:w="1182" w:type="pct"/>
             <w:tcBorders>
               <w:top w:val="single" w:sz="8" w:space="0" w:color="00647A"/>
               <w:left w:val="single" w:sz="8" w:space="0" w:color="00647A"/>
@@ -2869,7 +3622,7 @@
         </w:tc>
         <w:tc>
           <w:tcPr>
-            <w:tcW w:w="3819" w:type="pct"/>
+            <w:tcW w:w="3818" w:type="pct"/>
             <w:gridSpan w:val="4"/>
             <w:tcBorders>
               <w:top w:val="single" w:sz="8" w:space="0" w:color="00647A"/>
@@ -2898,7 +3651,7 @@
         </w:trPr>
         <w:tc>
           <w:tcPr>
-            <w:tcW w:w="1181" w:type="pct"/>
+            <w:tcW w:w="1182" w:type="pct"/>
             <w:tcBorders>
               <w:top w:val="single" w:sz="8" w:space="0" w:color="00647A"/>
               <w:left w:val="single" w:sz="8" w:space="0" w:color="00647A"/>
@@ -2929,7 +3682,7 @@
         </w:tc>
         <w:tc>
           <w:tcPr>
-            <w:tcW w:w="3819" w:type="pct"/>
+            <w:tcW w:w="3818" w:type="pct"/>
             <w:gridSpan w:val="4"/>
             <w:tcBorders>
               <w:top w:val="single" w:sz="8" w:space="0" w:color="00647A"/>
@@ -2960,7 +3713,7 @@
         </w:trPr>
         <w:tc>
           <w:tcPr>
-            <w:tcW w:w="1181" w:type="pct"/>
+            <w:tcW w:w="1182" w:type="pct"/>
             <w:vMerge w:val="restart"/>
             <w:tcBorders>
               <w:top w:val="single" w:sz="8" w:space="0" w:color="00647A"/>
@@ -2992,7 +3745,7 @@
         </w:tc>
         <w:tc>
           <w:tcPr>
-            <w:tcW w:w="451" w:type="pct"/>
+            <w:tcW w:w="533" w:type="pct"/>
             <w:tcBorders>
               <w:top w:val="single" w:sz="8" w:space="0" w:color="00647A"/>
               <w:left w:val="single" w:sz="8" w:space="0" w:color="00647A"/>
@@ -3034,7 +3787,7 @@
         </w:tc>
         <w:tc>
           <w:tcPr>
-            <w:tcW w:w="1121" w:type="pct"/>
+            <w:tcW w:w="1038" w:type="pct"/>
             <w:tcBorders>
               <w:top w:val="single" w:sz="8" w:space="0" w:color="00647A"/>
               <w:left w:val="single" w:sz="8" w:space="0" w:color="00647A"/>
@@ -3155,7 +3908,7 @@
         </w:trPr>
         <w:tc>
           <w:tcPr>
-            <w:tcW w:w="1181" w:type="pct"/>
+            <w:tcW w:w="1182" w:type="pct"/>
             <w:vMerge/>
             <w:tcBorders>
               <w:left w:val="single" w:sz="8" w:space="0" w:color="00647A"/>
@@ -3172,7 +3925,7 @@
         </w:tc>
         <w:tc>
           <w:tcPr>
-            <w:tcW w:w="451" w:type="pct"/>
+            <w:tcW w:w="533" w:type="pct"/>
             <w:tcBorders>
               <w:top w:val="single" w:sz="8" w:space="0" w:color="00647A"/>
               <w:left w:val="single" w:sz="8" w:space="0" w:color="00647A"/>
@@ -3198,7 +3951,7 @@
         </w:tc>
         <w:tc>
           <w:tcPr>
-            <w:tcW w:w="1121" w:type="pct"/>
+            <w:tcW w:w="1038" w:type="pct"/>
             <w:tcBorders>
               <w:top w:val="single" w:sz="8" w:space="0" w:color="00647A"/>
               <w:left w:val="single" w:sz="8" w:space="0" w:color="00647A"/>
@@ -3269,7 +4022,7 @@
         </w:trPr>
         <w:tc>
           <w:tcPr>
-            <w:tcW w:w="1181" w:type="pct"/>
+            <w:tcW w:w="1182" w:type="pct"/>
             <w:vMerge/>
             <w:tcBorders>
               <w:left w:val="single" w:sz="8" w:space="0" w:color="00647A"/>
@@ -3286,7 +4039,7 @@
         </w:tc>
         <w:tc>
           <w:tcPr>
-            <w:tcW w:w="451" w:type="pct"/>
+            <w:tcW w:w="533" w:type="pct"/>
             <w:tcBorders>
               <w:top w:val="single" w:sz="8" w:space="0" w:color="00647A"/>
               <w:left w:val="single" w:sz="8" w:space="0" w:color="00647A"/>
@@ -3312,7 +4065,7 @@
         </w:tc>
         <w:tc>
           <w:tcPr>
-            <w:tcW w:w="1121" w:type="pct"/>
+            <w:tcW w:w="1038" w:type="pct"/>
             <w:tcBorders>
               <w:top w:val="single" w:sz="8" w:space="0" w:color="00647A"/>
               <w:left w:val="single" w:sz="8" w:space="0" w:color="00647A"/>
@@ -3383,7 +4136,7 @@
         </w:trPr>
         <w:tc>
           <w:tcPr>
-            <w:tcW w:w="1181" w:type="pct"/>
+            <w:tcW w:w="1182" w:type="pct"/>
             <w:vMerge/>
             <w:tcBorders>
               <w:left w:val="single" w:sz="8" w:space="0" w:color="00647A"/>
@@ -3400,7 +4153,7 @@
         </w:tc>
         <w:tc>
           <w:tcPr>
-            <w:tcW w:w="451" w:type="pct"/>
+            <w:tcW w:w="533" w:type="pct"/>
             <w:tcBorders>
               <w:top w:val="single" w:sz="8" w:space="0" w:color="00647A"/>
               <w:left w:val="single" w:sz="8" w:space="0" w:color="00647A"/>
@@ -3426,7 +4179,7 @@
         </w:tc>
         <w:tc>
           <w:tcPr>
-            <w:tcW w:w="1121" w:type="pct"/>
+            <w:tcW w:w="1038" w:type="pct"/>
             <w:tcBorders>
               <w:top w:val="single" w:sz="8" w:space="0" w:color="00647A"/>
               <w:left w:val="single" w:sz="8" w:space="0" w:color="00647A"/>
@@ -3497,7 +4250,7 @@
         </w:trPr>
         <w:tc>
           <w:tcPr>
-            <w:tcW w:w="1181" w:type="pct"/>
+            <w:tcW w:w="1182" w:type="pct"/>
             <w:vMerge/>
             <w:tcBorders>
               <w:left w:val="single" w:sz="8" w:space="0" w:color="00647A"/>
@@ -3517,7 +4270,7 @@
         </w:tc>
         <w:tc>
           <w:tcPr>
-            <w:tcW w:w="451" w:type="pct"/>
+            <w:tcW w:w="533" w:type="pct"/>
             <w:tcBorders>
               <w:top w:val="single" w:sz="8" w:space="0" w:color="00647A"/>
               <w:left w:val="single" w:sz="8" w:space="0" w:color="00647A"/>
@@ -3543,7 +4296,7 @@
         </w:tc>
         <w:tc>
           <w:tcPr>
-            <w:tcW w:w="1121" w:type="pct"/>
+            <w:tcW w:w="1038" w:type="pct"/>
             <w:tcBorders>
               <w:top w:val="single" w:sz="8" w:space="0" w:color="00647A"/>
               <w:left w:val="single" w:sz="8" w:space="0" w:color="00647A"/>
@@ -3614,7 +4367,7 @@
         </w:trPr>
         <w:tc>
           <w:tcPr>
-            <w:tcW w:w="1181" w:type="pct"/>
+            <w:tcW w:w="1182" w:type="pct"/>
             <w:vMerge/>
             <w:tcBorders>
               <w:left w:val="single" w:sz="8" w:space="0" w:color="00647A"/>
@@ -3631,7 +4384,7 @@
         </w:tc>
         <w:tc>
           <w:tcPr>
-            <w:tcW w:w="451" w:type="pct"/>
+            <w:tcW w:w="533" w:type="pct"/>
             <w:tcBorders>
               <w:top w:val="single" w:sz="8" w:space="0" w:color="00647A"/>
               <w:left w:val="single" w:sz="8" w:space="0" w:color="00647A"/>
@@ -3657,7 +4410,7 @@
         </w:tc>
         <w:tc>
           <w:tcPr>
-            <w:tcW w:w="1121" w:type="pct"/>
+            <w:tcW w:w="1038" w:type="pct"/>
             <w:tcBorders>
               <w:top w:val="single" w:sz="8" w:space="0" w:color="00647A"/>
               <w:left w:val="single" w:sz="8" w:space="0" w:color="00647A"/>
@@ -3728,7 +4481,7 @@
         </w:trPr>
         <w:tc>
           <w:tcPr>
-            <w:tcW w:w="1181" w:type="pct"/>
+            <w:tcW w:w="1182" w:type="pct"/>
             <w:vMerge/>
             <w:tcBorders>
               <w:left w:val="single" w:sz="8" w:space="0" w:color="00647A"/>
@@ -3747,7 +4500,7 @@
         </w:tc>
         <w:tc>
           <w:tcPr>
-            <w:tcW w:w="451" w:type="pct"/>
+            <w:tcW w:w="533" w:type="pct"/>
             <w:tcBorders>
               <w:top w:val="single" w:sz="8" w:space="0" w:color="00647A"/>
               <w:left w:val="single" w:sz="8" w:space="0" w:color="00647A"/>
@@ -3772,7 +4525,7 @@
         </w:tc>
         <w:tc>
           <w:tcPr>
-            <w:tcW w:w="1121" w:type="pct"/>
+            <w:tcW w:w="1038" w:type="pct"/>
             <w:tcBorders>
               <w:top w:val="single" w:sz="8" w:space="0" w:color="00647A"/>
               <w:left w:val="single" w:sz="8" w:space="0" w:color="00647A"/>
@@ -3843,7 +4596,7 @@
         </w:trPr>
         <w:tc>
           <w:tcPr>
-            <w:tcW w:w="1181" w:type="pct"/>
+            <w:tcW w:w="1182" w:type="pct"/>
             <w:vMerge/>
             <w:tcBorders>
               <w:left w:val="single" w:sz="8" w:space="0" w:color="00647A"/>
@@ -3862,7 +4615,7 @@
         </w:tc>
         <w:tc>
           <w:tcPr>
-            <w:tcW w:w="451" w:type="pct"/>
+            <w:tcW w:w="533" w:type="pct"/>
             <w:tcBorders>
               <w:top w:val="single" w:sz="8" w:space="0" w:color="00647A"/>
               <w:left w:val="single" w:sz="8" w:space="0" w:color="00647A"/>
@@ -3887,7 +4640,7 @@
         </w:tc>
         <w:tc>
           <w:tcPr>
-            <w:tcW w:w="1121" w:type="pct"/>
+            <w:tcW w:w="1038" w:type="pct"/>
             <w:tcBorders>
               <w:top w:val="single" w:sz="8" w:space="0" w:color="00647A"/>
               <w:left w:val="single" w:sz="8" w:space="0" w:color="00647A"/>
@@ -3958,7 +4711,7 @@
         </w:trPr>
         <w:tc>
           <w:tcPr>
-            <w:tcW w:w="1181" w:type="pct"/>
+            <w:tcW w:w="1182" w:type="pct"/>
             <w:vMerge/>
             <w:tcBorders>
               <w:left w:val="single" w:sz="8" w:space="0" w:color="00647A"/>
@@ -3977,7 +4730,7 @@
         </w:tc>
         <w:tc>
           <w:tcPr>
-            <w:tcW w:w="451" w:type="pct"/>
+            <w:tcW w:w="533" w:type="pct"/>
             <w:tcBorders>
               <w:top w:val="single" w:sz="8" w:space="0" w:color="00647A"/>
               <w:left w:val="single" w:sz="8" w:space="0" w:color="00647A"/>
@@ -4002,7 +4755,7 @@
         </w:tc>
         <w:tc>
           <w:tcPr>
-            <w:tcW w:w="1121" w:type="pct"/>
+            <w:tcW w:w="1038" w:type="pct"/>
             <w:tcBorders>
               <w:top w:val="single" w:sz="8" w:space="0" w:color="00647A"/>
               <w:left w:val="single" w:sz="8" w:space="0" w:color="00647A"/>
@@ -4073,7 +4826,7 @@
         </w:trPr>
         <w:tc>
           <w:tcPr>
-            <w:tcW w:w="1181" w:type="pct"/>
+            <w:tcW w:w="1182" w:type="pct"/>
             <w:vMerge/>
             <w:tcBorders>
               <w:left w:val="single" w:sz="8" w:space="0" w:color="00647A"/>
@@ -4092,7 +4845,7 @@
         </w:tc>
         <w:tc>
           <w:tcPr>
-            <w:tcW w:w="451" w:type="pct"/>
+            <w:tcW w:w="533" w:type="pct"/>
             <w:tcBorders>
               <w:top w:val="single" w:sz="8" w:space="0" w:color="00647A"/>
               <w:left w:val="single" w:sz="8" w:space="0" w:color="00647A"/>
@@ -4117,7 +4870,7 @@
         </w:tc>
         <w:tc>
           <w:tcPr>
-            <w:tcW w:w="1121" w:type="pct"/>
+            <w:tcW w:w="1038" w:type="pct"/>
             <w:tcBorders>
               <w:top w:val="single" w:sz="8" w:space="0" w:color="00647A"/>
               <w:left w:val="single" w:sz="8" w:space="0" w:color="00647A"/>
@@ -4188,7 +4941,7 @@
         </w:trPr>
         <w:tc>
           <w:tcPr>
-            <w:tcW w:w="1181" w:type="pct"/>
+            <w:tcW w:w="1182" w:type="pct"/>
             <w:vMerge/>
             <w:tcBorders>
               <w:left w:val="single" w:sz="8" w:space="0" w:color="00647A"/>
@@ -4207,7 +4960,7 @@
         </w:tc>
         <w:tc>
           <w:tcPr>
-            <w:tcW w:w="451" w:type="pct"/>
+            <w:tcW w:w="533" w:type="pct"/>
             <w:tcBorders>
               <w:top w:val="single" w:sz="8" w:space="0" w:color="00647A"/>
               <w:left w:val="single" w:sz="8" w:space="0" w:color="00647A"/>
@@ -4238,7 +4991,7 @@
         </w:tc>
         <w:tc>
           <w:tcPr>
-            <w:tcW w:w="1121" w:type="pct"/>
+            <w:tcW w:w="1038" w:type="pct"/>
             <w:tcBorders>
               <w:top w:val="single" w:sz="8" w:space="0" w:color="00647A"/>
               <w:left w:val="single" w:sz="8" w:space="0" w:color="00647A"/>
@@ -4318,7 +5071,7 @@
         </w:trPr>
         <w:tc>
           <w:tcPr>
-            <w:tcW w:w="1181" w:type="pct"/>
+            <w:tcW w:w="1182" w:type="pct"/>
             <w:vMerge/>
             <w:tcBorders>
               <w:left w:val="single" w:sz="8" w:space="0" w:color="00647A"/>
@@ -4338,7 +5091,7 @@
         </w:tc>
         <w:tc>
           <w:tcPr>
-            <w:tcW w:w="451" w:type="pct"/>
+            <w:tcW w:w="533" w:type="pct"/>
             <w:tcBorders>
               <w:top w:val="single" w:sz="8" w:space="0" w:color="00647A"/>
               <w:left w:val="single" w:sz="8" w:space="0" w:color="00647A"/>
@@ -4369,7 +5122,7 @@
         </w:tc>
         <w:tc>
           <w:tcPr>
-            <w:tcW w:w="1121" w:type="pct"/>
+            <w:tcW w:w="1038" w:type="pct"/>
             <w:tcBorders>
               <w:top w:val="single" w:sz="8" w:space="0" w:color="00647A"/>
               <w:left w:val="single" w:sz="8" w:space="0" w:color="00647A"/>
@@ -4449,7 +5202,7 @@
         </w:trPr>
         <w:tc>
           <w:tcPr>
-            <w:tcW w:w="1181" w:type="pct"/>
+            <w:tcW w:w="1182" w:type="pct"/>
             <w:vMerge/>
             <w:tcBorders>
               <w:left w:val="single" w:sz="8" w:space="0" w:color="00647A"/>
@@ -4469,7 +5222,7 @@
         </w:tc>
         <w:tc>
           <w:tcPr>
-            <w:tcW w:w="451" w:type="pct"/>
+            <w:tcW w:w="533" w:type="pct"/>
             <w:tcBorders>
               <w:top w:val="single" w:sz="8" w:space="0" w:color="00647A"/>
               <w:left w:val="single" w:sz="8" w:space="0" w:color="00647A"/>
@@ -4500,7 +5253,7 @@
         </w:tc>
         <w:tc>
           <w:tcPr>
-            <w:tcW w:w="1121" w:type="pct"/>
+            <w:tcW w:w="1038" w:type="pct"/>
             <w:tcBorders>
               <w:top w:val="single" w:sz="8" w:space="0" w:color="00647A"/>
               <w:left w:val="single" w:sz="8" w:space="0" w:color="00647A"/>
@@ -4580,7 +5333,7 @@
         </w:trPr>
         <w:tc>
           <w:tcPr>
-            <w:tcW w:w="1181" w:type="pct"/>
+            <w:tcW w:w="1182" w:type="pct"/>
             <w:vMerge w:val="restart"/>
             <w:tcBorders>
               <w:top w:val="single" w:sz="8" w:space="0" w:color="00647A"/>
@@ -4614,7 +5367,7 @@
         </w:tc>
         <w:tc>
           <w:tcPr>
-            <w:tcW w:w="451" w:type="pct"/>
+            <w:tcW w:w="533" w:type="pct"/>
             <w:tcBorders>
               <w:top w:val="single" w:sz="8" w:space="0" w:color="00647A"/>
               <w:left w:val="single" w:sz="8" w:space="0" w:color="00647A"/>
@@ -4645,7 +5398,7 @@
         </w:tc>
         <w:tc>
           <w:tcPr>
-            <w:tcW w:w="1121" w:type="pct"/>
+            <w:tcW w:w="1038" w:type="pct"/>
             <w:tcBorders>
               <w:top w:val="single" w:sz="8" w:space="0" w:color="00647A"/>
               <w:left w:val="single" w:sz="8" w:space="0" w:color="00647A"/>
@@ -4725,7 +5478,7 @@
         </w:trPr>
         <w:tc>
           <w:tcPr>
-            <w:tcW w:w="1181" w:type="pct"/>
+            <w:tcW w:w="1182" w:type="pct"/>
             <w:vMerge/>
             <w:tcBorders>
               <w:left w:val="single" w:sz="8" w:space="0" w:color="00647A"/>
@@ -4745,7 +5498,7 @@
         </w:tc>
         <w:tc>
           <w:tcPr>
-            <w:tcW w:w="451" w:type="pct"/>
+            <w:tcW w:w="533" w:type="pct"/>
             <w:tcBorders>
               <w:top w:val="single" w:sz="8" w:space="0" w:color="00647A"/>
               <w:left w:val="single" w:sz="8" w:space="0" w:color="00647A"/>
@@ -4776,7 +5529,7 @@
         </w:tc>
         <w:tc>
           <w:tcPr>
-            <w:tcW w:w="1121" w:type="pct"/>
+            <w:tcW w:w="1038" w:type="pct"/>
             <w:tcBorders>
               <w:top w:val="single" w:sz="8" w:space="0" w:color="00647A"/>
               <w:left w:val="single" w:sz="8" w:space="0" w:color="00647A"/>
@@ -4856,7 +5609,7 @@
         </w:trPr>
         <w:tc>
           <w:tcPr>
-            <w:tcW w:w="1181" w:type="pct"/>
+            <w:tcW w:w="1182" w:type="pct"/>
             <w:tcBorders>
               <w:top w:val="single" w:sz="8" w:space="0" w:color="00647A"/>
               <w:left w:val="single" w:sz="8" w:space="0" w:color="00647A"/>
@@ -4876,32 +5629,32 @@
         </w:tc>
         <w:tc>
           <w:tcPr>
-            <w:tcW w:w="451" w:type="pct"/>
-            <w:tcBorders>
-              <w:top w:val="single" w:sz="8" w:space="0" w:color="00647A"/>
-              <w:left w:val="single" w:sz="8" w:space="0" w:color="00647A"/>
-              <w:bottom w:val="single" w:sz="8" w:space="0" w:color="00647A"/>
-              <w:right w:val="single" w:sz="8" w:space="0" w:color="00647A"/>
-            </w:tcBorders>
-            <w:tcMar>
-              <w:top w:w="72" w:type="dxa"/>
-              <w:left w:w="144" w:type="dxa"/>
-              <w:bottom w:w="72" w:type="dxa"/>
-              <w:right w:w="144" w:type="dxa"/>
-            </w:tcMar>
-          </w:tcPr>
-          <w:p>
-            <w:pPr>
-              <w:spacing w:after="0"/>
-              <w:rPr>
-                <w:lang w:val="it-IT"/>
-              </w:rPr>
-            </w:pPr>
-          </w:p>
-        </w:tc>
-        <w:tc>
-          <w:tcPr>
-            <w:tcW w:w="1121" w:type="pct"/>
+            <w:tcW w:w="533" w:type="pct"/>
+            <w:tcBorders>
+              <w:top w:val="single" w:sz="8" w:space="0" w:color="00647A"/>
+              <w:left w:val="single" w:sz="8" w:space="0" w:color="00647A"/>
+              <w:bottom w:val="single" w:sz="8" w:space="0" w:color="00647A"/>
+              <w:right w:val="single" w:sz="8" w:space="0" w:color="00647A"/>
+            </w:tcBorders>
+            <w:tcMar>
+              <w:top w:w="72" w:type="dxa"/>
+              <w:left w:w="144" w:type="dxa"/>
+              <w:bottom w:w="72" w:type="dxa"/>
+              <w:right w:w="144" w:type="dxa"/>
+            </w:tcMar>
+          </w:tcPr>
+          <w:p>
+            <w:pPr>
+              <w:spacing w:after="0"/>
+              <w:rPr>
+                <w:lang w:val="it-IT"/>
+              </w:rPr>
+            </w:pPr>
+          </w:p>
+        </w:tc>
+        <w:tc>
+          <w:tcPr>
+            <w:tcW w:w="1038" w:type="pct"/>
             <w:tcBorders>
               <w:top w:val="single" w:sz="8" w:space="0" w:color="00647A"/>
               <w:left w:val="single" w:sz="8" w:space="0" w:color="00647A"/>
@@ -6739,33 +7492,13 @@
   <a:extraClrSchemeLst/>
   <a:extLst>
     <a:ext uri="{05A4C25C-085E-4340-85A3-A5531E510DB2}">
-      <thm15:themeFamily xmlns:thm15="http://schemas.microsoft.com/office/thememl/2012/main" xmlns="" name="Office Theme" id="{62F939B6-93AF-4DB8-9C6B-D6C7DFDC589F}" vid="{4A3C46E8-61CC-4603-A589-7422A47A8E4A}"/>
+      <thm15:themeFamily xmlns="" xmlns:thm15="http://schemas.microsoft.com/office/thememl/2012/main" name="Office Theme" id="{62F939B6-93AF-4DB8-9C6B-D6C7DFDC589F}" vid="{4A3C46E8-61CC-4603-A589-7422A47A8E4A}"/>
     </a:ext>
   </a:extLst>
 </a:theme>
 </file>
 
 <file path=customXml/item1.xml><?xml version="1.0" encoding="utf-8"?>
-<p:properties xmlns:p="http://schemas.microsoft.com/office/2006/metadata/properties" xmlns:xsi="http://www.w3.org/2001/XMLSchema-instance" xmlns:pc="http://schemas.microsoft.com/office/infopath/2007/PartnerControls">
-  <documentManagement>
-    <lcf76f155ced4ddcb4097134ff3c332f xmlns="1c3d7916-4775-4ff5-b1b3-350f756dda2c">
-      <Terms xmlns="http://schemas.microsoft.com/office/infopath/2007/PartnerControls"/>
-    </lcf76f155ced4ddcb4097134ff3c332f>
-    <TaxCatchAll xmlns="5a494a96-b3cc-41dd-9b8d-72544d40af1f" xsi:nil="true"/>
-  </documentManagement>
-</p:properties>
-</file>
-
-<file path=customXml/item2.xml><?xml version="1.0" encoding="utf-8"?>
-<?mso-contentType ?>
-<FormTemplates xmlns="http://schemas.microsoft.com/sharepoint/v3/contenttype/forms">
-  <Display>DocumentLibraryForm</Display>
-  <Edit>DocumentLibraryForm</Edit>
-  <New>DocumentLibraryForm</New>
-</FormTemplates>
-</file>
-
-<file path=customXml/item3.xml><?xml version="1.0" encoding="utf-8"?>
 <ct:contentTypeSchema xmlns:ct="http://schemas.microsoft.com/office/2006/metadata/contentType" xmlns:ma="http://schemas.microsoft.com/office/2006/metadata/properties/metaAttributes" ct:_="" ma:_="" ma:contentTypeName="Document" ma:contentTypeID="0x0101009B3F3B303F07A640A5912E5017969207" ma:contentTypeVersion="10" ma:contentTypeDescription="Create a new document." ma:contentTypeScope="" ma:versionID="c97eca199467c4c5725dfaee38b73b2b">
   <xsd:schema xmlns:xsd="http://www.w3.org/2001/XMLSchema" xmlns:xs="http://www.w3.org/2001/XMLSchema" xmlns:p="http://schemas.microsoft.com/office/2006/metadata/properties" xmlns:ns2="1c3d7916-4775-4ff5-b1b3-350f756dda2c" xmlns:ns3="5a494a96-b3cc-41dd-9b8d-72544d40af1f" targetNamespace="http://schemas.microsoft.com/office/2006/metadata/properties" ma:root="true" ma:fieldsID="7cc530d0967b1c3d9b89c50fc64190e4" ns2:_="" ns3:_="">
     <xsd:import namespace="1c3d7916-4775-4ff5-b1b3-350f756dda2c"/>
@@ -6954,26 +7687,27 @@
 </ct:contentTypeSchema>
 </file>
 
-<file path=customXml/itemProps1.xml><?xml version="1.0" encoding="utf-8"?>
-<ds:datastoreItem xmlns:ds="http://schemas.openxmlformats.org/officeDocument/2006/customXml" ds:itemID="{22DC53CD-7600-45E1-A340-3B32F003E655}">
-  <ds:schemaRefs>
-    <ds:schemaRef ds:uri="http://schemas.microsoft.com/office/2006/metadata/properties"/>
-    <ds:schemaRef ds:uri="http://schemas.microsoft.com/office/infopath/2007/PartnerControls"/>
-    <ds:schemaRef ds:uri="1c3d7916-4775-4ff5-b1b3-350f756dda2c"/>
-    <ds:schemaRef ds:uri="5a494a96-b3cc-41dd-9b8d-72544d40af1f"/>
-  </ds:schemaRefs>
-</ds:datastoreItem>
+<file path=customXml/item2.xml><?xml version="1.0" encoding="utf-8"?>
+<?mso-contentType ?>
+<FormTemplates xmlns="http://schemas.microsoft.com/sharepoint/v3/contenttype/forms">
+  <Display>DocumentLibraryForm</Display>
+  <Edit>DocumentLibraryForm</Edit>
+  <New>DocumentLibraryForm</New>
+</FormTemplates>
 </file>
 
-<file path=customXml/itemProps2.xml><?xml version="1.0" encoding="utf-8"?>
-<ds:datastoreItem xmlns:ds="http://schemas.openxmlformats.org/officeDocument/2006/customXml" ds:itemID="{FC59D853-F923-4195-8C11-AB1DF8E0780B}">
-  <ds:schemaRefs>
-    <ds:schemaRef ds:uri="http://schemas.microsoft.com/sharepoint/v3/contenttype/forms"/>
-  </ds:schemaRefs>
-</ds:datastoreItem>
+<file path=customXml/item3.xml><?xml version="1.0" encoding="utf-8"?>
+<p:properties xmlns:p="http://schemas.microsoft.com/office/2006/metadata/properties" xmlns:xsi="http://www.w3.org/2001/XMLSchema-instance" xmlns:pc="http://schemas.microsoft.com/office/infopath/2007/PartnerControls">
+  <documentManagement>
+    <lcf76f155ced4ddcb4097134ff3c332f xmlns="1c3d7916-4775-4ff5-b1b3-350f756dda2c">
+      <Terms xmlns="http://schemas.microsoft.com/office/infopath/2007/PartnerControls"/>
+    </lcf76f155ced4ddcb4097134ff3c332f>
+    <TaxCatchAll xmlns="5a494a96-b3cc-41dd-9b8d-72544d40af1f" xsi:nil="true"/>
+  </documentManagement>
+</p:properties>
 </file>
 
-<file path=customXml/itemProps3.xml><?xml version="1.0" encoding="utf-8"?>
+<file path=customXml/itemProps1.xml><?xml version="1.0" encoding="utf-8"?>
 <ds:datastoreItem xmlns:ds="http://schemas.openxmlformats.org/officeDocument/2006/customXml" ds:itemID="{AECE33DA-74EC-44D2-BDCA-0233F59E47BA}">
   <ds:schemaRefs>
     <ds:schemaRef ds:uri="http://schemas.microsoft.com/office/2006/metadata/contentType"/>
@@ -6990,4 +7724,23 @@
     <ds:schemaRef ds:uri="http://schemas.microsoft.com/internal/obd"/>
   </ds:schemaRefs>
 </ds:datastoreItem>
+</file>
+
+<file path=customXml/itemProps2.xml><?xml version="1.0" encoding="utf-8"?>
+<ds:datastoreItem xmlns:ds="http://schemas.openxmlformats.org/officeDocument/2006/customXml" ds:itemID="{FC59D853-F923-4195-8C11-AB1DF8E0780B}">
+  <ds:schemaRefs>
+    <ds:schemaRef ds:uri="http://schemas.microsoft.com/sharepoint/v3/contenttype/forms"/>
+  </ds:schemaRefs>
+</ds:datastoreItem>
+</file>
+
+<file path=customXml/itemProps3.xml><?xml version="1.0" encoding="utf-8"?>
+<ds:datastoreItem xmlns:ds="http://schemas.openxmlformats.org/officeDocument/2006/customXml" ds:itemID="{22DC53CD-7600-45E1-A340-3B32F003E655}">
+  <ds:schemaRefs>
+    <ds:schemaRef ds:uri="http://schemas.microsoft.com/office/2006/metadata/properties"/>
+    <ds:schemaRef ds:uri="http://schemas.microsoft.com/office/infopath/2007/PartnerControls"/>
+    <ds:schemaRef ds:uri="1c3d7916-4775-4ff5-b1b3-350f756dda2c"/>
+    <ds:schemaRef ds:uri="5a494a96-b3cc-41dd-9b8d-72544d40af1f"/>
+  </ds:schemaRefs>
+</ds:datastoreItem>
 </file>
</xml_diff>

<commit_message>
Update .gitignore to include LaTeX build artifacts; add new full mock-up images and documentation files
</commit_message>
<xml_diff>
--- a/Documentazione/Documentazione finale/UseCasesCockburn.docx
+++ b/Documentazione/Documentazione finale/UseCasesCockburn.docx
@@ -1065,7 +1065,13 @@
               <w:spacing w:after="0"/>
             </w:pPr>
             <w:r>
-              <w:t>Clicks the “Submit” button to confirm the operation</w:t>
+              <w:t>Clicks the “</w:t>
+            </w:r>
+            <w:r>
+              <w:t>Create Issue</w:t>
+            </w:r>
+            <w:r>
+              <w:t>” button to confirm the operation</w:t>
             </w:r>
           </w:p>
         </w:tc>
@@ -2034,19 +2040,7 @@
               <w:rPr>
                 <w:lang w:val="en-US"/>
               </w:rPr>
-              <w:t>The U</w:t>
-            </w:r>
-            <w:r>
-              <w:rPr>
-                <w:lang w:val="en-US"/>
-              </w:rPr>
-              <w:t xml:space="preserve">ser select a </w:t>
-            </w:r>
-            <w:r>
-              <w:rPr>
-                <w:lang w:val="en-US"/>
-              </w:rPr>
-              <w:t>file with size &gt;5MB</w:t>
+              <w:t>The User select a file with size &gt;5MB</w:t>
             </w:r>
           </w:p>
         </w:tc>
@@ -3169,6 +3163,8 @@
         </w:rPr>
         <w:br w:type="page"/>
       </w:r>
+      <w:bookmarkStart w:id="0" w:name="_GoBack"/>
+      <w:bookmarkEnd w:id="0"/>
     </w:p>
     <w:tbl>
       <w:tblPr>
@@ -4021,18 +4017,7 @@
               <w:t>ll active issues, asking the Admin</w:t>
             </w:r>
             <w:r>
-              <w:t xml:space="preserve"> to select the issue describing the same problem</w:t>
-            </w:r>
-          </w:p>
-          <w:p>
-            <w:pPr>
-              <w:spacing w:after="0"/>
-            </w:pPr>
-            <w:bookmarkStart w:id="0" w:name="_GoBack"/>
-            <w:bookmarkEnd w:id="0"/>
-            <w:r>
-              <w:br/>
-              <w:t>Note: if no issues are available, the system displays a “No active issues.” message</w:t>
+              <w:t xml:space="preserve"> to select the original issue</w:t>
             </w:r>
           </w:p>
         </w:tc>
@@ -4485,11 +4470,10 @@
         </w:tc>
       </w:tr>
     </w:tbl>
-    <w:p/>
     <w:tbl>
       <w:tblPr>
-        <w:tblW w:w="5000" w:type="pct"/>
-        <w:tblInd w:w="-134" w:type="dxa"/>
+        <w:tblpPr w:leftFromText="141" w:rightFromText="141" w:vertAnchor="text" w:horzAnchor="margin" w:tblpX="-132" w:tblpY="-55"/>
+        <w:tblW w:w="5090" w:type="pct"/>
         <w:tblCellMar>
           <w:left w:w="0" w:type="dxa"/>
           <w:right w:w="0" w:type="dxa"/>
@@ -4497,10 +4481,10 @@
         <w:tblLook w:val="04A0" w:firstRow="1" w:lastRow="0" w:firstColumn="1" w:lastColumn="0" w:noHBand="0" w:noVBand="1"/>
       </w:tblPr>
       <w:tblGrid>
-        <w:gridCol w:w="2317"/>
-        <w:gridCol w:w="883"/>
-        <w:gridCol w:w="3376"/>
-        <w:gridCol w:w="3216"/>
+        <w:gridCol w:w="2460"/>
+        <w:gridCol w:w="887"/>
+        <w:gridCol w:w="3391"/>
+        <w:gridCol w:w="3230"/>
       </w:tblGrid>
       <w:tr>
         <w:trPr>
@@ -4508,12 +4492,11 @@
         </w:trPr>
         <w:tc>
           <w:tcPr>
-            <w:tcW w:w="1183" w:type="pct"/>
+            <w:tcW w:w="1234" w:type="pct"/>
             <w:vMerge w:val="restart"/>
             <w:tcBorders>
               <w:top w:val="single" w:sz="8" w:space="0" w:color="00647A"/>
               <w:left w:val="single" w:sz="8" w:space="0" w:color="00647A"/>
-              <w:bottom w:val="single" w:sz="4" w:space="0" w:color="auto"/>
               <w:right w:val="single" w:sz="8" w:space="0" w:color="00647A"/>
             </w:tcBorders>
             <w:vAlign w:val="center"/>
@@ -4531,7 +4514,7 @@
                 <w:b/>
                 <w:lang w:val="en-US"/>
               </w:rPr>
-              <w:t>Extension 3</w:t>
+              <w:t>Extension 2</w:t>
             </w:r>
             <w:r>
               <w:rPr>
@@ -4550,26 +4533,13 @@
               <w:rPr>
                 <w:lang w:val="en-US"/>
               </w:rPr>
-              <w:t>The User c</w:t>
-            </w:r>
-            <w:r>
-              <w:rPr>
-                <w:lang w:val="en-US"/>
-              </w:rPr>
-              <w:t xml:space="preserve">licks the “Cancel” </w:t>
-            </w:r>
-            <w:r>
-              <w:rPr>
-                <w:lang w:val="en-US"/>
-              </w:rPr>
-              <w:lastRenderedPageBreak/>
-              <w:t>button</w:t>
-            </w:r>
-          </w:p>
-        </w:tc>
-        <w:tc>
-          <w:tcPr>
-            <w:tcW w:w="451" w:type="pct"/>
+              <w:t>The System detects there are no active issues</w:t>
+            </w:r>
+          </w:p>
+        </w:tc>
+        <w:tc>
+          <w:tcPr>
+            <w:tcW w:w="445" w:type="pct"/>
             <w:tcBorders>
               <w:top w:val="single" w:sz="8" w:space="0" w:color="00647A"/>
               <w:left w:val="single" w:sz="8" w:space="0" w:color="00647A"/>
@@ -4591,20 +4561,13 @@
               <w:rPr>
                 <w:lang w:val="it-IT"/>
               </w:rPr>
-              <w:lastRenderedPageBreak/>
-              <w:t>3</w:t>
-            </w:r>
-            <w:r>
-              <w:rPr>
-                <w:lang w:val="it-IT"/>
-              </w:rPr>
-              <w:t>a1</w:t>
-            </w:r>
-          </w:p>
-        </w:tc>
-        <w:tc>
-          <w:tcPr>
-            <w:tcW w:w="1724" w:type="pct"/>
+              <w:t>2a1</w:t>
+            </w:r>
+          </w:p>
+        </w:tc>
+        <w:tc>
+          <w:tcPr>
+            <w:tcW w:w="1701" w:type="pct"/>
             <w:tcBorders>
               <w:top w:val="single" w:sz="8" w:space="0" w:color="00647A"/>
               <w:left w:val="single" w:sz="8" w:space="0" w:color="00647A"/>
@@ -4622,39 +4585,11 @@
             <w:pPr>
               <w:spacing w:after="0"/>
             </w:pPr>
-            <w:proofErr w:type="spellStart"/>
-            <w:r>
-              <w:rPr>
-                <w:lang w:val="it-IT"/>
-              </w:rPr>
-              <w:t>Clicks</w:t>
-            </w:r>
-            <w:proofErr w:type="spellEnd"/>
-            <w:r>
-              <w:rPr>
-                <w:lang w:val="it-IT"/>
-              </w:rPr>
-              <w:t xml:space="preserve"> “</w:t>
-            </w:r>
-            <w:proofErr w:type="spellStart"/>
-            <w:r>
-              <w:rPr>
-                <w:lang w:val="it-IT"/>
-              </w:rPr>
-              <w:t>Cancel</w:t>
-            </w:r>
-            <w:proofErr w:type="spellEnd"/>
-            <w:r>
-              <w:rPr>
-                <w:lang w:val="it-IT"/>
-              </w:rPr>
-              <w:t>”</w:t>
-            </w:r>
-          </w:p>
-        </w:tc>
-        <w:tc>
-          <w:tcPr>
-            <w:tcW w:w="1642" w:type="pct"/>
+          </w:p>
+        </w:tc>
+        <w:tc>
+          <w:tcPr>
+            <w:tcW w:w="1620" w:type="pct"/>
             <w:tcBorders>
               <w:top w:val="single" w:sz="8" w:space="0" w:color="00647A"/>
               <w:left w:val="single" w:sz="8" w:space="0" w:color="00647A"/>
@@ -4672,6 +4607,9 @@
             <w:pPr>
               <w:spacing w:after="0"/>
             </w:pPr>
+            <w:r>
+              <w:t>Sees there are no active issues</w:t>
+            </w:r>
           </w:p>
         </w:tc>
       </w:tr>
@@ -4681,10 +4619,9 @@
         </w:trPr>
         <w:tc>
           <w:tcPr>
-            <w:tcW w:w="1183" w:type="pct"/>
+            <w:tcW w:w="1234" w:type="pct"/>
             <w:vMerge/>
             <w:tcBorders>
-              <w:top w:val="single" w:sz="4" w:space="0" w:color="auto"/>
               <w:left w:val="single" w:sz="8" w:space="0" w:color="00647A"/>
               <w:bottom w:val="single" w:sz="4" w:space="0" w:color="auto"/>
               <w:right w:val="single" w:sz="8" w:space="0" w:color="00647A"/>
@@ -4693,16 +4630,18 @@
           </w:tcPr>
           <w:p>
             <w:pPr>
-              <w:spacing w:after="0"/>
-              <w:rPr>
-                <w:lang w:val="it-IT"/>
-              </w:rPr>
-            </w:pPr>
-          </w:p>
-        </w:tc>
-        <w:tc>
-          <w:tcPr>
-            <w:tcW w:w="451" w:type="pct"/>
+              <w:spacing w:after="0" w:line="276" w:lineRule="auto"/>
+              <w:jc w:val="center"/>
+              <w:rPr>
+                <w:b/>
+                <w:lang w:val="en-US"/>
+              </w:rPr>
+            </w:pPr>
+          </w:p>
+        </w:tc>
+        <w:tc>
+          <w:tcPr>
+            <w:tcW w:w="445" w:type="pct"/>
             <w:tcBorders>
               <w:top w:val="single" w:sz="8" w:space="0" w:color="00647A"/>
               <w:left w:val="single" w:sz="8" w:space="0" w:color="00647A"/>
@@ -4727,19 +4666,13 @@
               <w:rPr>
                 <w:lang w:val="it-IT"/>
               </w:rPr>
-              <w:t>3</w:t>
-            </w:r>
-            <w:r>
-              <w:rPr>
-                <w:lang w:val="it-IT"/>
-              </w:rPr>
-              <w:t>a2</w:t>
-            </w:r>
-          </w:p>
-        </w:tc>
-        <w:tc>
-          <w:tcPr>
-            <w:tcW w:w="1724" w:type="pct"/>
+              <w:t>2a2</w:t>
+            </w:r>
+          </w:p>
+        </w:tc>
+        <w:tc>
+          <w:tcPr>
+            <w:tcW w:w="1701" w:type="pct"/>
             <w:tcBorders>
               <w:top w:val="single" w:sz="8" w:space="0" w:color="00647A"/>
               <w:left w:val="single" w:sz="8" w:space="0" w:color="00647A"/>
@@ -4756,15 +4689,12 @@
           <w:p>
             <w:pPr>
               <w:spacing w:after="0"/>
-              <w:rPr>
-                <w:lang w:val="it-IT"/>
-              </w:rPr>
-            </w:pPr>
-          </w:p>
-        </w:tc>
-        <w:tc>
-          <w:tcPr>
-            <w:tcW w:w="1642" w:type="pct"/>
+            </w:pPr>
+          </w:p>
+        </w:tc>
+        <w:tc>
+          <w:tcPr>
+            <w:tcW w:w="1620" w:type="pct"/>
             <w:tcBorders>
               <w:top w:val="single" w:sz="8" w:space="0" w:color="00647A"/>
               <w:left w:val="single" w:sz="8" w:space="0" w:color="00647A"/>
@@ -4781,27 +4711,288 @@
           <w:p>
             <w:pPr>
               <w:spacing w:after="0"/>
-              <w:rPr>
-                <w:lang w:val="en-US"/>
-              </w:rPr>
-            </w:pPr>
-            <w:r>
-              <w:rPr>
-                <w:lang w:val="en-US"/>
-              </w:rPr>
-              <w:t>Returns to the issue details view</w:t>
+            </w:pPr>
+            <w:r>
+              <w:t>Displays the message: “No active issues.”</w:t>
+            </w:r>
+          </w:p>
+        </w:tc>
+      </w:tr>
+      <w:tr>
+        <w:trPr>
+          <w:trHeight w:val="20"/>
+        </w:trPr>
+        <w:tc>
+          <w:tcPr>
+            <w:tcW w:w="1234" w:type="pct"/>
+            <w:vMerge w:val="restart"/>
+            <w:tcBorders>
+              <w:top w:val="single" w:sz="4" w:space="0" w:color="auto"/>
+              <w:left w:val="single" w:sz="8" w:space="0" w:color="00647A"/>
+              <w:right w:val="single" w:sz="8" w:space="0" w:color="00647A"/>
+            </w:tcBorders>
+            <w:vAlign w:val="center"/>
+          </w:tcPr>
+          <w:p>
+            <w:pPr>
+              <w:spacing w:after="0"/>
+              <w:rPr>
+                <w:lang w:val="en-US"/>
+              </w:rPr>
+            </w:pPr>
+            <w:r>
+              <w:rPr>
+                <w:b/>
+                <w:lang w:val="en-US"/>
+              </w:rPr>
+              <w:t>Extension 3</w:t>
+            </w:r>
+            <w:r>
+              <w:rPr>
+                <w:b/>
+                <w:lang w:val="en-US"/>
+              </w:rPr>
+              <w:t>a</w:t>
+            </w:r>
+            <w:r>
+              <w:rPr>
+                <w:lang w:val="en-US"/>
+              </w:rPr>
+              <w:t>: The User c</w:t>
+            </w:r>
+            <w:r>
+              <w:rPr>
+                <w:lang w:val="en-US"/>
+              </w:rPr>
+              <w:t xml:space="preserve">licks the “Cancel” </w:t>
+            </w:r>
+          </w:p>
+        </w:tc>
+        <w:tc>
+          <w:tcPr>
+            <w:tcW w:w="445" w:type="pct"/>
+            <w:tcBorders>
+              <w:top w:val="single" w:sz="8" w:space="0" w:color="00647A"/>
+              <w:left w:val="single" w:sz="8" w:space="0" w:color="00647A"/>
+              <w:bottom w:val="single" w:sz="8" w:space="0" w:color="00647A"/>
+              <w:right w:val="single" w:sz="8" w:space="0" w:color="00647A"/>
+            </w:tcBorders>
+            <w:tcMar>
+              <w:top w:w="72" w:type="dxa"/>
+              <w:left w:w="144" w:type="dxa"/>
+              <w:bottom w:w="72" w:type="dxa"/>
+              <w:right w:w="144" w:type="dxa"/>
+            </w:tcMar>
+          </w:tcPr>
+          <w:p>
+            <w:pPr>
+              <w:spacing w:after="0"/>
+              <w:rPr>
+                <w:lang w:val="en-US"/>
+              </w:rPr>
+            </w:pPr>
+            <w:r>
+              <w:rPr>
+                <w:lang w:val="en-US"/>
+              </w:rPr>
+              <w:t>3a1</w:t>
+            </w:r>
+          </w:p>
+        </w:tc>
+        <w:tc>
+          <w:tcPr>
+            <w:tcW w:w="1701" w:type="pct"/>
+            <w:tcBorders>
+              <w:top w:val="single" w:sz="8" w:space="0" w:color="00647A"/>
+              <w:left w:val="single" w:sz="8" w:space="0" w:color="00647A"/>
+              <w:bottom w:val="single" w:sz="8" w:space="0" w:color="00647A"/>
+              <w:right w:val="single" w:sz="8" w:space="0" w:color="00647A"/>
+            </w:tcBorders>
+            <w:tcMar>
+              <w:top w:w="72" w:type="dxa"/>
+              <w:left w:w="144" w:type="dxa"/>
+              <w:bottom w:w="72" w:type="dxa"/>
+              <w:right w:w="144" w:type="dxa"/>
+            </w:tcMar>
+          </w:tcPr>
+          <w:p>
+            <w:pPr>
+              <w:spacing w:after="0"/>
+              <w:rPr>
+                <w:lang w:val="en-US"/>
+              </w:rPr>
+            </w:pPr>
+            <w:proofErr w:type="spellStart"/>
+            <w:r>
+              <w:rPr>
+                <w:lang w:val="it-IT"/>
+              </w:rPr>
+              <w:t>Clicks</w:t>
+            </w:r>
+            <w:proofErr w:type="spellEnd"/>
+            <w:r>
+              <w:rPr>
+                <w:lang w:val="it-IT"/>
+              </w:rPr>
+              <w:t xml:space="preserve"> “</w:t>
+            </w:r>
+            <w:proofErr w:type="spellStart"/>
+            <w:r>
+              <w:rPr>
+                <w:lang w:val="it-IT"/>
+              </w:rPr>
+              <w:t>Cancel</w:t>
+            </w:r>
+            <w:proofErr w:type="spellEnd"/>
+            <w:r>
+              <w:rPr>
+                <w:lang w:val="it-IT"/>
+              </w:rPr>
+              <w:t>”</w:t>
+            </w:r>
+          </w:p>
+        </w:tc>
+        <w:tc>
+          <w:tcPr>
+            <w:tcW w:w="1620" w:type="pct"/>
+            <w:tcBorders>
+              <w:top w:val="single" w:sz="8" w:space="0" w:color="00647A"/>
+              <w:left w:val="single" w:sz="8" w:space="0" w:color="00647A"/>
+              <w:bottom w:val="single" w:sz="8" w:space="0" w:color="00647A"/>
+              <w:right w:val="single" w:sz="8" w:space="0" w:color="00647A"/>
+            </w:tcBorders>
+            <w:tcMar>
+              <w:top w:w="72" w:type="dxa"/>
+              <w:left w:w="144" w:type="dxa"/>
+              <w:bottom w:w="72" w:type="dxa"/>
+              <w:right w:w="144" w:type="dxa"/>
+            </w:tcMar>
+          </w:tcPr>
+          <w:p>
+            <w:pPr>
+              <w:spacing w:after="0"/>
+              <w:rPr>
+                <w:lang w:val="en-US"/>
+              </w:rPr>
+            </w:pPr>
+          </w:p>
+        </w:tc>
+      </w:tr>
+      <w:tr>
+        <w:trPr>
+          <w:trHeight w:val="20"/>
+        </w:trPr>
+        <w:tc>
+          <w:tcPr>
+            <w:tcW w:w="1234" w:type="pct"/>
+            <w:vMerge/>
+            <w:tcBorders>
+              <w:left w:val="single" w:sz="8" w:space="0" w:color="00647A"/>
+              <w:bottom w:val="single" w:sz="4" w:space="0" w:color="auto"/>
+              <w:right w:val="single" w:sz="8" w:space="0" w:color="00647A"/>
+            </w:tcBorders>
+            <w:vAlign w:val="center"/>
+          </w:tcPr>
+          <w:p>
+            <w:pPr>
+              <w:spacing w:after="0"/>
+              <w:rPr>
+                <w:b/>
+                <w:lang w:val="en-US"/>
+              </w:rPr>
+            </w:pPr>
+          </w:p>
+        </w:tc>
+        <w:tc>
+          <w:tcPr>
+            <w:tcW w:w="445" w:type="pct"/>
+            <w:tcBorders>
+              <w:top w:val="single" w:sz="8" w:space="0" w:color="00647A"/>
+              <w:left w:val="single" w:sz="8" w:space="0" w:color="00647A"/>
+              <w:bottom w:val="single" w:sz="8" w:space="0" w:color="00647A"/>
+              <w:right w:val="single" w:sz="8" w:space="0" w:color="00647A"/>
+            </w:tcBorders>
+            <w:tcMar>
+              <w:top w:w="72" w:type="dxa"/>
+              <w:left w:w="144" w:type="dxa"/>
+              <w:bottom w:w="72" w:type="dxa"/>
+              <w:right w:w="144" w:type="dxa"/>
+            </w:tcMar>
+          </w:tcPr>
+          <w:p>
+            <w:pPr>
+              <w:spacing w:after="0"/>
+              <w:rPr>
+                <w:lang w:val="en-US"/>
+              </w:rPr>
+            </w:pPr>
+            <w:r>
+              <w:rPr>
+                <w:lang w:val="en-US"/>
+              </w:rPr>
+              <w:t>3a2</w:t>
+            </w:r>
+          </w:p>
+        </w:tc>
+        <w:tc>
+          <w:tcPr>
+            <w:tcW w:w="1701" w:type="pct"/>
+            <w:tcBorders>
+              <w:top w:val="single" w:sz="8" w:space="0" w:color="00647A"/>
+              <w:left w:val="single" w:sz="8" w:space="0" w:color="00647A"/>
+              <w:bottom w:val="single" w:sz="8" w:space="0" w:color="00647A"/>
+              <w:right w:val="single" w:sz="8" w:space="0" w:color="00647A"/>
+            </w:tcBorders>
+            <w:tcMar>
+              <w:top w:w="72" w:type="dxa"/>
+              <w:left w:w="144" w:type="dxa"/>
+              <w:bottom w:w="72" w:type="dxa"/>
+              <w:right w:w="144" w:type="dxa"/>
+            </w:tcMar>
+          </w:tcPr>
+          <w:p>
+            <w:pPr>
+              <w:spacing w:after="0"/>
+              <w:rPr>
+                <w:lang w:val="it-IT"/>
+              </w:rPr>
+            </w:pPr>
+          </w:p>
+        </w:tc>
+        <w:tc>
+          <w:tcPr>
+            <w:tcW w:w="1620" w:type="pct"/>
+            <w:tcBorders>
+              <w:top w:val="single" w:sz="8" w:space="0" w:color="00647A"/>
+              <w:left w:val="single" w:sz="8" w:space="0" w:color="00647A"/>
+              <w:bottom w:val="single" w:sz="8" w:space="0" w:color="00647A"/>
+              <w:right w:val="single" w:sz="8" w:space="0" w:color="00647A"/>
+            </w:tcBorders>
+            <w:tcMar>
+              <w:top w:w="72" w:type="dxa"/>
+              <w:left w:w="144" w:type="dxa"/>
+              <w:bottom w:w="72" w:type="dxa"/>
+              <w:right w:w="144" w:type="dxa"/>
+            </w:tcMar>
+          </w:tcPr>
+          <w:p>
+            <w:pPr>
+              <w:spacing w:after="0"/>
+              <w:rPr>
+                <w:lang w:val="en-US"/>
+              </w:rPr>
+            </w:pPr>
+            <w:r>
+              <w:rPr>
+                <w:lang w:val="en-US"/>
+              </w:rPr>
+              <w:t>Returns to main board</w:t>
             </w:r>
           </w:p>
         </w:tc>
       </w:tr>
     </w:tbl>
-    <w:p>
-      <w:pPr>
-        <w:rPr>
-          <w:lang w:val="en-US"/>
-        </w:rPr>
-      </w:pPr>
-    </w:p>
+    <w:p/>
     <w:sectPr>
       <w:pgSz w:w="11906" w:h="16838"/>
       <w:pgMar w:top="1417" w:right="1134" w:bottom="1134" w:left="1134" w:header="708" w:footer="708" w:gutter="0"/>

</xml_diff>

<commit_message>
Minor update to UseCasesCockburn document
</commit_message>
<xml_diff>
--- a/Documentazione/Documentazione finale/UseCasesCockburn.docx
+++ b/Documentazione/Documentazione finale/UseCasesCockburn.docx
@@ -3163,8 +3163,6 @@
         </w:rPr>
         <w:br w:type="page"/>
       </w:r>
-      <w:bookmarkStart w:id="0" w:name="_GoBack"/>
-      <w:bookmarkEnd w:id="0"/>
     </w:p>
     <w:tbl>
       <w:tblPr>
@@ -4986,8 +4984,16 @@
               <w:rPr>
                 <w:lang w:val="en-US"/>
               </w:rPr>
-              <w:t>Returns to main board</w:t>
-            </w:r>
+              <w:t xml:space="preserve">Returns to </w:t>
+            </w:r>
+            <w:r>
+              <w:rPr>
+                <w:lang w:val="en-US"/>
+              </w:rPr>
+              <w:t>issue details view</w:t>
+            </w:r>
+            <w:bookmarkStart w:id="0" w:name="_GoBack"/>
+            <w:bookmarkEnd w:id="0"/>
           </w:p>
         </w:tc>
       </w:tr>

</xml_diff>